<commit_message>
A2: added partially filled up A2_form
</commit_message>
<xml_diff>
--- a/forms/A2_form.docx
+++ b/forms/A2_form.docx
@@ -131,11 +131,8 @@
             <w:tcW w:type="dxa" w:w="5860"/>
           </w:tcPr>
           <w:p>
-            <w:pPr>
-              <w:spacing w:after="80"/>
-            </w:pPr>
-            <w:r>
-              <w:t xml:space="preserve"/>
+            <w:r>
+              <w:t>BanglaHomeoRAG</w:t>
             </w:r>
           </w:p>
         </w:tc>
@@ -577,11 +574,8 @@
             <w:tcW w:type="dxa" w:w="5860"/>
           </w:tcPr>
           <w:p>
-            <w:pPr>
-              <w:spacing w:after="80"/>
-            </w:pPr>
-            <w:r>
-              <w:t xml:space="preserve"/>
+            <w:r>
+              <w:t>Domain: historical Bengali homeopathy home-medicine lookup (user: BHMS student / rural extension practitioner). Data speciality: code-switching -- Bangla script with transliterated Latin/Greek remedy names and Bengali potency numerals. Primary NFR: robust/reliable, optimised as groundedness with 100% citation.</w:t>
             </w:r>
           </w:p>
         </w:tc>
@@ -625,11 +619,8 @@
             <w:tcW w:type="dxa" w:w="5860"/>
           </w:tcPr>
           <w:p>
-            <w:pPr>
-              <w:spacing w:after="80"/>
-            </w:pPr>
-            <w:r>
-              <w:t xml:space="preserve"/>
+            <w:r>
+              <w:t>nfr_target (configs/task.yaml): groundedness &gt;= 0.95 and cited-answer-rate = 1.0 -- every answer carries a book+page citation, or the system abstains. [Carry forward the exact baseline number/method from your A1 form here -- not reproduced in this draft.]</w:t>
             </w:r>
           </w:p>
         </w:tc>
@@ -673,11 +664,8 @@
             <w:tcW w:type="dxa" w:w="5860"/>
           </w:tcPr>
           <w:p>
-            <w:pPr>
-              <w:spacing w:after="80"/>
-            </w:pPr>
-            <w:r>
-              <w:t xml:space="preserve"/>
+            <w:r>
+              <w:t>Two public-domain Bengali homeopathy manuals from the Digital Library of India / Internet Archive: bk1 'Homeopathic Paribarik Chikitsa' (1919, TEST/held-out) and bk2 'Homiopyathik Chikitsa Bidhan Vol.1' (1908, TRAIN). 1,107 usable scanned page-images after JP2-&gt;PNG conversion (662 + 445; 29 non-content boundary pages -- covers/blanks/scan-cards -- failed conversion harmlessly). Split by whole book, never by page, so no page is shared across splits. Hard to read: pre-1948 orthography, conjunct/matra clusters (যুক্তাক্ষর), mixed Bangla+Latin remedy names, Bengali potency numerals (৬/৩০/২০০). [TODO: insert exact page/word counts once notebooks/eda.ipynb is executed and grading_kit/manifest.yaml is filled -- floor is &gt;=300 pages / &gt;=60,000 words, already comfortably cleared on page count.]</w:t>
             </w:r>
           </w:p>
         </w:tc>
@@ -769,11 +757,8 @@
             <w:tcW w:type="dxa" w:w="5860"/>
           </w:tcPr>
           <w:p>
-            <w:pPr>
-              <w:spacing w:after="80"/>
-            </w:pPr>
-            <w:r>
-              <w:t xml:space="preserve"/>
+            <w:r>
+              <w:t>Pages are dominantly single-column running prose with occasional headings/footnotes in a smaller register. Characters are formed from consistent Bangla script strokes and conjunct/matra shapes that stay locally consistent regardless of where they sit on the page -- this is why whole-page OCR (below) works as well as it does on this corpus.</w:t>
             </w:r>
           </w:p>
         </w:tc>
@@ -817,11 +802,8 @@
             <w:tcW w:type="dxa" w:w="5860"/>
           </w:tcPr>
           <w:p>
-            <w:pPr>
-              <w:spacing w:after="80"/>
-            </w:pPr>
-            <w:r>
-              <w:t xml:space="preserve"/>
+            <w:r>
+              <w:t>Bangla word order and remedy-entry structure are regular enough that one entry (remedy name -&gt; symptoms -&gt; potency/dose) forms a coherent local unit. Our chunking exploits this so a remedy's dose stays with its name instead of being split mid-entry by a fixed-size window.</w:t>
             </w:r>
           </w:p>
         </w:tc>
@@ -865,11 +847,8 @@
             <w:tcW w:type="dxa" w:w="5860"/>
           </w:tcPr>
           <w:p>
-            <w:pPr>
-              <w:spacing w:after="80"/>
-            </w:pPr>
-            <w:r>
-              <w:t xml:space="preserve"/>
+            <w:r>
+              <w:t>Page position/order, exact font weight, mild skew/foxing, and OCR engine minor-version should not change which remedy/page gets retrieved or cited -- this is exactly what the code-switching speciality and the whole-page-OCR A/B test (Section 3) were measured against.</w:t>
             </w:r>
           </w:p>
         </w:tc>
@@ -1027,18 +1006,8 @@
             <w:tcW w:type="dxa" w:w="2900"/>
           </w:tcPr>
           <w:p>
-            <w:pPr>
-              <w:spacing w:after="80"/>
-            </w:pPr>
-            <w:r>
-              <w:rPr>
-                <w:i/>
-                <w:iCs/>
-                <w:color w:val="595959"/>
-                <w:sz w:val="18"/>
-                <w:szCs w:val="18"/>
-              </w:rPr>
-              <w:t xml:space="preserve">e.g. classical denoise vs VAE vs diffusion</w:t>
+            <w:r>
+              <w:t>Classical denoise/binarize vs a learned enhancement model (VAE/diffusion) vs none</w:t>
             </w:r>
           </w:p>
         </w:tc>
@@ -1047,11 +1016,8 @@
             <w:tcW w:type="dxa" w:w="3200"/>
           </w:tcPr>
           <w:p>
-            <w:pPr>
-              <w:spacing w:after="80"/>
-            </w:pPr>
-            <w:r>
-              <w:t xml:space="preserve"/>
+            <w:r>
+              <w:t>None -- enhance.enabled: false. Our data speciality is code-switching, not physically degraded scans, so a learned cleanup model wasn't justified; classical preprocessing (passthrough + autocontrast) already covers our actual failure mode.</w:t>
             </w:r>
           </w:p>
         </w:tc>
@@ -1060,11 +1026,8 @@
             <w:tcW w:type="dxa" w:w="1560"/>
           </w:tcPr>
           <w:p>
-            <w:pPr>
-              <w:spacing w:after="80"/>
-            </w:pPr>
-            <w:r>
-              <w:t xml:space="preserve"/>
+            <w:r>
+              <w:t>N/A -- bonus stage, not attempted</w:t>
             </w:r>
           </w:p>
         </w:tc>
@@ -1088,18 +1051,8 @@
             <w:tcW w:type="dxa" w:w="2900"/>
           </w:tcPr>
           <w:p>
-            <w:pPr>
-              <w:spacing w:after="80"/>
-            </w:pPr>
-            <w:r>
-              <w:rPr>
-                <w:i/>
-                <w:iCs/>
-                <w:color w:val="595959"/>
-                <w:sz w:val="18"/>
-                <w:szCs w:val="18"/>
-              </w:rPr>
-              <w:t xml:space="preserve">e.g. heuristic vs detection model</w:t>
+            <w:r>
+              <w:t>Tesseract block-segmentation (group word-boxes into heading/body regions) vs whole-page (one full-page region per page)</w:t>
             </w:r>
           </w:p>
         </w:tc>
@@ -1108,11 +1061,8 @@
             <w:tcW w:type="dxa" w:w="3200"/>
           </w:tcPr>
           <w:p>
-            <w:pPr>
-              <w:spacing w:after="80"/>
-            </w:pPr>
-            <w:r>
-              <w:t xml:space="preserve"/>
+            <w:r>
+              <w:t>Whole-page (layout.mode: whole_page). Measured on the 30-page bk1 held-out set: block mean CER 0.483 vs whole-page 0.184. Block segmentation caused catastrophic mis-segmentation on ~9 pages (up to CER 5.69) with no benefit on this single-column corpus.</w:t>
             </w:r>
           </w:p>
         </w:tc>
@@ -1121,11 +1071,8 @@
             <w:tcW w:type="dxa" w:w="1560"/>
           </w:tcPr>
           <w:p>
-            <w:pPr>
-              <w:spacing w:after="80"/>
-            </w:pPr>
-            <w:r>
-              <w:t xml:space="preserve"/>
+            <w:r>
+              <w:t>No -- heuristic Tesseract word-box grouping, not a trained detection model</w:t>
             </w:r>
           </w:p>
         </w:tc>
@@ -1149,18 +1096,8 @@
             <w:tcW w:type="dxa" w:w="2900"/>
           </w:tcPr>
           <w:p>
-            <w:pPr>
-              <w:spacing w:after="80"/>
-            </w:pPr>
-            <w:r>
-              <w:rPr>
-                <w:i/>
-                <w:iCs/>
-                <w:color w:val="595959"/>
-                <w:sz w:val="18"/>
-                <w:szCs w:val="18"/>
-              </w:rPr>
-              <w:t xml:space="preserve">e.g. Tesseract vs TrOCR vs Donut</w:t>
+            <w:r>
+              <w:t>Tesseract 5 (ben+eng) vs a Bangla-capable neural OCR (Surya / a bn TrOCR checkpoint)</w:t>
             </w:r>
           </w:p>
         </w:tc>
@@ -1169,11 +1106,8 @@
             <w:tcW w:type="dxa" w:w="3200"/>
           </w:tcPr>
           <w:p>
-            <w:pPr>
-              <w:spacing w:after="80"/>
-            </w:pPr>
-            <w:r>
-              <w:t xml:space="preserve"/>
+            <w:r>
+              <w:t>Tesseract 5 baseline, whole-page pass at --psm 3. Two bugs fixed while measuring: (1) whole-page regions now OCR the original page image directly -- a re-saved crop dropped scan DPI and broke PSM-3 segmentation on sparse pages; (2) the TSV parser now uses csv.QUOTE_NONE -- a stray " in OCR'd text was otherwise read as a CSV quote and silently swallowed following rows, inflating 5 pages to CER 3-4x. Final held-out mean CER 0.184 (target &lt;=0.15, not yet met). Neural fallback for low-confidence pages is planned, not yet implemented (ocr.fallback is empty).</w:t>
             </w:r>
           </w:p>
         </w:tc>
@@ -1182,11 +1116,8 @@
             <w:tcW w:type="dxa" w:w="1560"/>
           </w:tcPr>
           <w:p>
-            <w:pPr>
-              <w:spacing w:after="80"/>
-            </w:pPr>
-            <w:r>
-              <w:t xml:space="preserve"/>
+            <w:r>
+              <w:t>Yes -- pretrained Tesseract 5 ben+eng model, reproduced as our OCR baseline</w:t>
             </w:r>
           </w:p>
         </w:tc>
@@ -1210,18 +1141,8 @@
             <w:tcW w:type="dxa" w:w="2900"/>
           </w:tcPr>
           <w:p>
-            <w:pPr>
-              <w:spacing w:after="80"/>
-            </w:pPr>
-            <w:r>
-              <w:rPr>
-                <w:i/>
-                <w:iCs/>
-                <w:color w:val="595959"/>
-                <w:sz w:val="18"/>
-                <w:szCs w:val="18"/>
-              </w:rPr>
-              <w:t xml:space="preserve">e.g. fixed vs semantic; size/overlap</w:t>
+            <w:r>
+              <w:t>Fixed-size token windows vs semantic/entry-aware chunking</w:t>
             </w:r>
           </w:p>
         </w:tc>
@@ -1230,11 +1151,8 @@
             <w:tcW w:type="dxa" w:w="3200"/>
           </w:tcPr>
           <w:p>
-            <w:pPr>
-              <w:spacing w:after="80"/>
-            </w:pPr>
-            <w:r>
-              <w:t xml:space="preserve"/>
+            <w:r>
+              <w:t>Entry-aware: normalize text, mark remedy-alias occurrences (canonicalizing Bangla/Latin spelling variants, e.g. ভিরেট্রাম/Veratrum -&gt; veratrum_album), start a new chunk at each remedy marker so a remedy's symptoms/potency/dose stay together, falling back to a 512-token / 64-overlap window (bge-m3 tokenizer) only when a single entry exceeds the limit.</w:t>
             </w:r>
           </w:p>
         </w:tc>
@@ -1243,11 +1161,8 @@
             <w:tcW w:type="dxa" w:w="1560"/>
           </w:tcPr>
           <w:p>
-            <w:pPr>
-              <w:spacing w:after="80"/>
-            </w:pPr>
-            <w:r>
-              <w:t xml:space="preserve"/>
+            <w:r>
+              <w:t>No -- rule-based chunking logic, not a pretrained/published method</w:t>
             </w:r>
           </w:p>
         </w:tc>
@@ -1271,18 +1186,8 @@
             <w:tcW w:type="dxa" w:w="2900"/>
           </w:tcPr>
           <w:p>
-            <w:pPr>
-              <w:spacing w:after="80"/>
-            </w:pPr>
-            <w:r>
-              <w:rPr>
-                <w:i/>
-                <w:iCs/>
-                <w:color w:val="595959"/>
-                <w:sz w:val="18"/>
-                <w:szCs w:val="18"/>
-              </w:rPr>
-              <w:t xml:space="preserve">e.g. which sentence-embedding model</w:t>
+            <w:r>
+              <w:t>BAAI/bge-m3 (multilingual) vs an English-only sentence embedding (e.g. MiniLM)</w:t>
             </w:r>
           </w:p>
         </w:tc>
@@ -1291,11 +1196,8 @@
             <w:tcW w:type="dxa" w:w="3200"/>
           </w:tcPr>
           <w:p>
-            <w:pPr>
-              <w:spacing w:after="80"/>
-            </w:pPr>
-            <w:r>
-              <w:t xml:space="preserve"/>
+            <w:r>
+              <w:t>bge-m3 (dim 1024, fp16 on GPU) -- multilingual and actually covers Bengali, unlike an English-only default which would not represent Bangla or code-switched remedy names well.</w:t>
             </w:r>
           </w:p>
         </w:tc>
@@ -1304,11 +1206,8 @@
             <w:tcW w:type="dxa" w:w="1560"/>
           </w:tcPr>
           <w:p>
-            <w:pPr>
-              <w:spacing w:after="80"/>
-            </w:pPr>
-            <w:r>
-              <w:t xml:space="preserve"/>
+            <w:r>
+              <w:t>Yes -- pretrained bge-m3 checkpoint used as-is, no fine-tuning</w:t>
             </w:r>
           </w:p>
         </w:tc>
@@ -1332,18 +1231,8 @@
             <w:tcW w:type="dxa" w:w="2900"/>
           </w:tcPr>
           <w:p>
-            <w:pPr>
-              <w:spacing w:after="80"/>
-            </w:pPr>
-            <w:r>
-              <w:rPr>
-                <w:i/>
-                <w:iCs/>
-                <w:color w:val="595959"/>
-                <w:sz w:val="18"/>
-                <w:szCs w:val="18"/>
-              </w:rPr>
-              <w:t xml:space="preserve">e.g. flat vs HNSW vs IVF/PQ</w:t>
+            <w:r>
+              <w:t>FAISS Flat (exact) vs HNSW / IVF-PQ (approximate)</w:t>
             </w:r>
           </w:p>
         </w:tc>
@@ -1352,11 +1241,8 @@
             <w:tcW w:type="dxa" w:w="3200"/>
           </w:tcPr>
           <w:p>
-            <w:pPr>
-              <w:spacing w:after="80"/>
-            </w:pPr>
-            <w:r>
-              <w:t xml:space="preserve"/>
+            <w:r>
+              <w:t>Flat -- our corpus is small (~1,100 pages), so exact search is fast enough and avoids the recall loss an approximate index trades for speed at a scale we don't need yet.</w:t>
             </w:r>
           </w:p>
         </w:tc>
@@ -1365,11 +1251,8 @@
             <w:tcW w:type="dxa" w:w="1560"/>
           </w:tcPr>
           <w:p>
-            <w:pPr>
-              <w:spacing w:after="80"/>
-            </w:pPr>
-            <w:r>
-              <w:t xml:space="preserve"/>
+            <w:r>
+              <w:t>N/A -- off-the-shelf index data structure, not a learned/pretrained component</w:t>
             </w:r>
           </w:p>
         </w:tc>
@@ -1524,11 +1407,8 @@
             <w:tcW w:type="dxa" w:w="2700"/>
           </w:tcPr>
           <w:p>
-            <w:pPr>
-              <w:spacing w:after="80"/>
-            </w:pPr>
-            <w:r>
-              <w:t xml:space="preserve"/>
+            <w:r>
+              <w:t>None (rule-based ingest); no enhancement model</w:t>
             </w:r>
           </w:p>
         </w:tc>
@@ -1537,11 +1417,8 @@
             <w:tcW w:type="dxa" w:w="2400"/>
           </w:tcPr>
           <w:p>
-            <w:pPr>
-              <w:spacing w:after="80"/>
-            </w:pPr>
-            <w:r>
-              <w:t xml:space="preserve"/>
+            <w:r>
+              <w:t>preprocess.mode=passthrough, autocontrast=true, deskew/denoise/sharpen/binarize=false; enhance.enabled=false</w:t>
             </w:r>
           </w:p>
         </w:tc>
@@ -1550,11 +1427,8 @@
             <w:tcW w:type="dxa" w:w="2360"/>
           </w:tcPr>
           <w:p>
-            <w:pPr>
-              <w:spacing w:after="80"/>
-            </w:pPr>
-            <w:r>
-              <w:t xml:space="preserve"/>
+            <w:r>
+              <w:t>N/A -- no learned model in this stage</w:t>
             </w:r>
           </w:p>
         </w:tc>
@@ -1578,11 +1452,8 @@
             <w:tcW w:type="dxa" w:w="2700"/>
           </w:tcPr>
           <w:p>
-            <w:pPr>
-              <w:spacing w:after="80"/>
-            </w:pPr>
-            <w:r>
-              <w:t xml:space="preserve"/>
+            <w:r>
+              <w:t>Tesseract 5 (--psm 3), used for text location only</w:t>
             </w:r>
           </w:p>
         </w:tc>
@@ -1591,11 +1462,8 @@
             <w:tcW w:type="dxa" w:w="2400"/>
           </w:tcPr>
           <w:p>
-            <w:pPr>
-              <w:spacing w:after="80"/>
-            </w:pPr>
-            <w:r>
-              <w:t xml:space="preserve"/>
+            <w:r>
+              <w:t>layout.mode=whole_page</w:t>
             </w:r>
           </w:p>
         </w:tc>
@@ -1604,11 +1472,8 @@
             <w:tcW w:type="dxa" w:w="2360"/>
           </w:tcPr>
           <w:p>
-            <w:pPr>
-              <w:spacing w:after="80"/>
-            </w:pPr>
-            <w:r>
-              <w:t xml:space="preserve"/>
+            <w:r>
+              <w:t>Pretrained (Tesseract ben+eng) used purely as a text-locator, not fine-tuned</w:t>
             </w:r>
           </w:p>
         </w:tc>
@@ -1632,11 +1497,8 @@
             <w:tcW w:type="dxa" w:w="2700"/>
           </w:tcPr>
           <w:p>
-            <w:pPr>
-              <w:spacing w:after="80"/>
-            </w:pPr>
-            <w:r>
-              <w:t xml:space="preserve"/>
+            <w:r>
+              <w:t>Tesseract 5, tesseract:ben (ben+eng)</w:t>
             </w:r>
           </w:p>
         </w:tc>
@@ -1645,11 +1507,8 @@
             <w:tcW w:type="dxa" w:w="2400"/>
           </w:tcPr>
           <w:p>
-            <w:pPr>
-              <w:spacing w:after="80"/>
-            </w:pPr>
-            <w:r>
-              <w:t xml:space="preserve"/>
+            <w:r>
+              <w:t>oem=1, body_psm=3, conf_threshold=0.60</w:t>
             </w:r>
           </w:p>
         </w:tc>
@@ -1658,11 +1517,8 @@
             <w:tcW w:type="dxa" w:w="2360"/>
           </w:tcPr>
           <w:p>
-            <w:pPr>
-              <w:spacing w:after="80"/>
-            </w:pPr>
-            <w:r>
-              <w:t xml:space="preserve"/>
+            <w:r>
+              <w:t>Pretrained baseline; finetune=false -- flip to true only if CER forces it (currently 0.184 vs 0.15 target)</w:t>
             </w:r>
           </w:p>
         </w:tc>
@@ -1686,11 +1542,8 @@
             <w:tcW w:type="dxa" w:w="2700"/>
           </w:tcPr>
           <w:p>
-            <w:pPr>
-              <w:spacing w:after="80"/>
-            </w:pPr>
-            <w:r>
-              <w:t xml:space="preserve"/>
+            <w:r>
+              <w:t>BAAI/bge-m3 tokenizer only (no chunking model)</w:t>
             </w:r>
           </w:p>
         </w:tc>
@@ -1699,11 +1552,8 @@
             <w:tcW w:type="dxa" w:w="2400"/>
           </w:tcPr>
           <w:p>
-            <w:pPr>
-              <w:spacing w:after="80"/>
-            </w:pPr>
-            <w:r>
-              <w:t xml:space="preserve"/>
+            <w:r>
+              <w:t>chunk_tokens=512, overlap=64, entry-aware via normalization.remedy_aliases</w:t>
             </w:r>
           </w:p>
         </w:tc>
@@ -1712,11 +1562,8 @@
             <w:tcW w:type="dxa" w:w="2360"/>
           </w:tcPr>
           <w:p>
-            <w:pPr>
-              <w:spacing w:after="80"/>
-            </w:pPr>
-            <w:r>
-              <w:t xml:space="preserve"/>
+            <w:r>
+              <w:t>N/A -- rule-based</w:t>
             </w:r>
           </w:p>
         </w:tc>
@@ -1740,11 +1587,8 @@
             <w:tcW w:type="dxa" w:w="2700"/>
           </w:tcPr>
           <w:p>
-            <w:pPr>
-              <w:spacing w:after="80"/>
-            </w:pPr>
-            <w:r>
-              <w:t xml:space="preserve"/>
+            <w:r>
+              <w:t>BAAI/bge-m3</w:t>
             </w:r>
           </w:p>
         </w:tc>
@@ -1753,11 +1597,8 @@
             <w:tcW w:type="dxa" w:w="2400"/>
           </w:tcPr>
           <w:p>
-            <w:pPr>
-              <w:spacing w:after="80"/>
-            </w:pPr>
-            <w:r>
-              <w:t xml:space="preserve"/>
+            <w:r>
+              <w:t>dim=1024, batch_size=4, max_length=512, use_fp16=true, device=cuda (falls back to cpu)</w:t>
             </w:r>
           </w:p>
         </w:tc>
@@ -1766,11 +1607,8 @@
             <w:tcW w:type="dxa" w:w="2360"/>
           </w:tcPr>
           <w:p>
-            <w:pPr>
-              <w:spacing w:after="80"/>
-            </w:pPr>
-            <w:r>
-              <w:t xml:space="preserve"/>
+            <w:r>
+              <w:t>Pretrained, used as-is</w:t>
             </w:r>
           </w:p>
         </w:tc>
@@ -1794,11 +1632,8 @@
             <w:tcW w:type="dxa" w:w="2700"/>
           </w:tcPr>
           <w:p>
-            <w:pPr>
-              <w:spacing w:after="80"/>
-            </w:pPr>
-            <w:r>
-              <w:t xml:space="preserve"/>
+            <w:r>
+              <w:t>FAISS IndexFlat (faiss:flat)</w:t>
             </w:r>
           </w:p>
         </w:tc>
@@ -1807,11 +1642,8 @@
             <w:tcW w:type="dxa" w:w="2400"/>
           </w:tcPr>
           <w:p>
-            <w:pPr>
-              <w:spacing w:after="80"/>
-            </w:pPr>
-            <w:r>
-              <w:t xml:space="preserve"/>
+            <w:r>
+              <w:t>L2-normalized vectors (cosine similarity via inner product)</w:t>
             </w:r>
           </w:p>
         </w:tc>
@@ -1820,11 +1652,8 @@
             <w:tcW w:type="dxa" w:w="2360"/>
           </w:tcPr>
           <w:p>
-            <w:pPr>
-              <w:spacing w:after="80"/>
-            </w:pPr>
-            <w:r>
-              <w:t xml:space="preserve"/>
+            <w:r>
+              <w:t>N/A -- deterministic data structure, not a learned model</w:t>
             </w:r>
           </w:p>
         </w:tc>
@@ -1885,11 +1714,8 @@
             <w:tcW w:type="dxa" w:w="5860"/>
           </w:tcPr>
           <w:p>
-            <w:pPr>
-              <w:spacing w:after="80"/>
-            </w:pPr>
-            <w:r>
-              <w:t xml:space="preserve"/>
+            <w:r>
+              <w:t>pages (data/raw/&lt;book&gt;/*.png) -&gt; preprocess (passthrough+autocontrast) -&gt; enhance (off) -&gt; layout (whole-page region) -&gt; OCR (Tesseract 5 ben+eng, PSM 3, QUOTE_NONE-safe TSV) -&gt; [PII redaction hook] -&gt; chunk (entry-aware, 512/64 fallback) -&gt; [pre-index hook] -&gt; embed (bge-m3, 1024-d) -&gt; store (FAISS flat, L2-normalized). Changed from the default: layout switched from block-segmentation to whole-page after a measured CER regression (0.483 vs 0.184).</w:t>
             </w:r>
           </w:p>
         </w:tc>
@@ -1981,11 +1807,8 @@
             <w:tcW w:type="dxa" w:w="5860"/>
           </w:tcPr>
           <w:p>
-            <w:pPr>
-              <w:spacing w:after="80"/>
-            </w:pPr>
-            <w:r>
-              <w:t xml:space="preserve"/>
+            <w:r>
+              <w:t>Mean character error rate (CER) 0.184 over the 30-page bk1 held-out set (grading_kit/heldout_pages/ + labels.jsonl), measured after fixing two bugs (DPI loss on re-saved crops; Tesseract-TSV quote-swallowing). Target from A1 was &lt;=0.15 -- not yet met. Caveat: held-out labels are currently Qwen-VLM-generated, not yet human-verified -- treat this number as provisional until spot-checked by hand. [TODO: re-run and save this measurement inside notebooks/kb_demo.ipynb before submission -- per the grading gate, a number with no notebook evidence scores zero.]</w:t>
             </w:r>
           </w:p>
         </w:tc>
@@ -2029,11 +1852,8 @@
             <w:tcW w:type="dxa" w:w="5860"/>
           </w:tcPr>
           <w:p>
-            <w:pPr>
-              <w:spacing w:after="80"/>
-            </w:pPr>
-            <w:r>
-              <w:t xml:space="preserve"/>
+            <w:r>
+              <w:t>Known from config: embedding dimension 1024 (BAAI/bge-m3); index type FAISS Flat. [TODO: chunks indexed, and pages/words indexed vs total corpus, require an actual full-corpus build -- not yet run. Fill in real numbers from notebooks/kb_demo.ipynb / grading_kit/manifest.yaml before submission; do not report estimated numbers.]</w:t>
             </w:r>
           </w:p>
         </w:tc>
@@ -2077,11 +1897,8 @@
             <w:tcW w:type="dxa" w:w="5860"/>
           </w:tcPr>
           <w:p>
-            <w:pPr>
-              <w:spacing w:after="80"/>
-            </w:pPr>
-            <w:r>
-              <w:t xml:space="preserve"/>
+            <w:r>
+              <w:t>[TODO -- not yet captured. notebooks/kb_demo.ipynb Part 2 already contains a real query ('veratrum album dosage for cholera') plus a deliberately weak/out-of-corpus query to exercise is_weak(), but it has not been executed against a persisted index yet. Run it and paste the actual top-chunk result + whether it's the correct page here.]</w:t>
             </w:r>
           </w:p>
         </w:tc>
@@ -2125,11 +1942,8 @@
             <w:tcW w:type="dxa" w:w="5860"/>
           </w:tcPr>
           <w:p>
-            <w:pPr>
-              <w:spacing w:after="80"/>
-            </w:pPr>
-            <w:r>
-              <w:t xml:space="preserve"/>
+            <w:r>
+              <w:t>Two real failures caught while measuring OCR quality: (1) Tesseract block-layout segmentation catastrophically mis-read page bk1_p186 (CER 5.694 vs 0.195 for the same page read whole-page) -- block splitting scrambled/duplicated text on ~9 of 30 held-out pages, which is why we moved to whole-page OCR. (2) A csv-parsing bug: Tesseract's TSV output is unquoted, but Python's csv.DictReader treated a stray " inside OCR'd text as a quote character and silently merged following rows into one field, inflating 5 pages to CER 3-4x (e.g. bk1_p145: 4.054) until we forced quoting=csv.QUOTE_NONE. Both are fixed and verified (in-pipeline output now matches a raw full-page OCR pass exactly, delta=0.000); full read-on-why is in configs/design_choices.md (Layout/OCR rows).</w:t>
             </w:r>
           </w:p>
         </w:tc>
@@ -2226,11 +2040,8 @@
             <w:tcW w:type="dxa" w:w="5860"/>
           </w:tcPr>
           <w:p>
-            <w:pPr>
-              <w:spacing w:after="80"/>
-            </w:pPr>
-            <w:r>
-              <w:t xml:space="preserve"/>
+            <w:r>
+              <w:t>Retrieval (dense bge-m3 similarity, k=10 default) + reranking (BAAI/bge-reranker-v2-m3, narrow top-20 to top-5) + the agent loop over the nine fixed tools (retrieve/rerank/read_page/enhance_page/extract/aggregate/cite/calculator/escalate_to_human) + grounding/citation enforcement + PII redaction + prompt-injection guardrails + human-in-the-loop escalation when no page clears the confidence threshold, then an evaluation harness (recall@k, groundedness, verifiable- and judged-question accuracy).</w:t>
             </w:r>
           </w:p>
         </w:tc>
@@ -2274,11 +2085,8 @@
             <w:tcW w:type="dxa" w:w="5860"/>
           </w:tcPr>
           <w:p>
-            <w:pPr>
-              <w:spacing w:after="80"/>
-            </w:pPr>
-            <w:r>
-              <w:t xml:space="preserve"/>
+            <w:r>
+              <w:t>tasks.jsonl authored from real BHMS-practitioner-style questions grounded in bk1/bk2 remedy entries: a mix of verifiable (exact-match against a known quoted dose/potency line) and judged (multi-step reasoning, LLM-judged) items, plus deliberate out-of-corpus questions whose correct answer is to abstain -- including at least one matched needs_research:true/false pair to exercise the mandatory evidence-gated re-search behaviour.</w:t>
             </w:r>
           </w:p>
         </w:tc>
@@ -2322,11 +2130,8 @@
             <w:tcW w:type="dxa" w:w="5860"/>
           </w:tcPr>
           <w:p>
-            <w:pPr>
-              <w:spacing w:after="80"/>
-            </w:pPr>
-            <w:r>
-              <w:t xml:space="preserve"/>
+            <w:r>
+              <w:t>OCR CER (0.184) is still above our 0.15 target, so some fraction of retrieved evidence will be genuinely noisy going into A3 -- if the agent grounds an answer on a mis-read remedy name or potency number, it could confidently cite a wrong page. First mitigation: keep the per-page confidence gate (conf_threshold=0.60) wired to escalate_to_human/abstain rather than answering off low-confidence OCR, and prioritise closing the CER gap (preprocessing tuning or the Bangla neural OCR fallback) before trusting citations at face value in A3 eval.</w:t>
             </w:r>
           </w:p>
         </w:tc>
@@ -2467,18 +2272,8 @@
             <w:tcW w:type="dxa" w:w="3400"/>
           </w:tcPr>
           <w:p>
-            <w:pPr>
-              <w:spacing w:after="80"/>
-            </w:pPr>
-            <w:r>
-              <w:rPr>
-                <w:i/>
-                <w:iCs/>
-                <w:color w:val="595959"/>
-                <w:sz w:val="18"/>
-                <w:szCs w:val="18"/>
-              </w:rPr>
-              <w:t xml:space="preserve">what these stages must achieve + success metric</w:t>
+            <w:r>
+              <w:t>Turn raw scans into a searchable, citation-preserving knowledge base clean enough to support &gt;=0.95 groundedness with 100% citation, within our robust/reliable NFR.</w:t>
             </w:r>
           </w:p>
         </w:tc>
@@ -2487,18 +2282,8 @@
             <w:tcW w:type="dxa" w:w="3760"/>
           </w:tcPr>
           <w:p>
-            <w:pPr>
-              <w:spacing w:after="80"/>
-            </w:pPr>
-            <w:r>
-              <w:rPr>
-                <w:i/>
-                <w:iCs/>
-                <w:color w:val="595959"/>
-                <w:sz w:val="18"/>
-                <w:szCs w:val="18"/>
-              </w:rPr>
-              <w:t xml:space="preserve">why this · its cost · what would change our mind</w:t>
+            <w:r>
+              <w:t>This is what every A3 answer depends on -- an agent can't be grounded if the retrieved text is wrong or uncited. Cost: OCR/layout accuracy work happens up-front, before any 'agent' behaviour exists. Would change if the NFR were e.g. latency instead of robustness -- we'd trade OCR quality work for speed.</w:t>
             </w:r>
           </w:p>
         </w:tc>
@@ -2522,18 +2307,8 @@
             <w:tcW w:type="dxa" w:w="3400"/>
           </w:tcPr>
           <w:p>
-            <w:pPr>
-              <w:spacing w:after="80"/>
-            </w:pPr>
-            <w:r>
-              <w:rPr>
-                <w:i/>
-                <w:iCs/>
-                <w:color w:val="595959"/>
-                <w:sz w:val="18"/>
-                <w:szCs w:val="18"/>
-              </w:rPr>
-              <w:t xml:space="preserve">inputs, formats, splits, any labels used</w:t>
+            <w:r>
+              <w:t>1,107 page-images (bk2=445 train / bk1=662 test, split by whole book); 30 bk1 held-out pages with page-level labels for OCR CER measurement.</w:t>
             </w:r>
           </w:p>
         </w:tc>
@@ -2542,18 +2317,8 @@
             <w:tcW w:type="dxa" w:w="3760"/>
           </w:tcPr>
           <w:p>
-            <w:pPr>
-              <w:spacing w:after="80"/>
-            </w:pPr>
-            <w:r>
-              <w:rPr>
-                <w:i/>
-                <w:iCs/>
-                <w:color w:val="595959"/>
-                <w:sz w:val="18"/>
-                <w:szCs w:val="18"/>
-              </w:rPr>
-              <w:t xml:space="preserve">why this · its cost · what would change our mind</w:t>
+            <w:r>
+              <w:t>Whole-book splitting makes cross-split leakage impossible by construction, which matters because both books quote overlapping Materia Medica passages. Cost: held-out labels are currently Qwen-generated, not human-verified -- our biggest current data-quality risk. Would change once labels are hand-verified.</w:t>
             </w:r>
           </w:p>
         </w:tc>
@@ -2577,18 +2342,8 @@
             <w:tcW w:type="dxa" w:w="3400"/>
           </w:tcPr>
           <w:p>
-            <w:pPr>
-              <w:spacing w:after="80"/>
-            </w:pPr>
-            <w:r>
-              <w:rPr>
-                <w:i/>
-                <w:iCs/>
-                <w:color w:val="595959"/>
-                <w:sz w:val="18"/>
-                <w:szCs w:val="18"/>
-              </w:rPr>
-              <w:t xml:space="preserve">checkpoints chosen per stage</w:t>
+            <w:r>
+              <w:t>Tesseract 5 (ben+eng) baseline OCR; BAAI/bge-m3 embeddings; FAISS Flat index. No layout/enhancement model -- both are rule-based or disabled.</w:t>
             </w:r>
           </w:p>
         </w:tc>
@@ -2597,18 +2352,8 @@
             <w:tcW w:type="dxa" w:w="3760"/>
           </w:tcPr>
           <w:p>
-            <w:pPr>
-              <w:spacing w:after="80"/>
-            </w:pPr>
-            <w:r>
-              <w:rPr>
-                <w:i/>
-                <w:iCs/>
-                <w:color w:val="595959"/>
-                <w:sz w:val="18"/>
-                <w:szCs w:val="18"/>
-              </w:rPr>
-              <w:t xml:space="preserve">why this · its cost · what would change our mind</w:t>
+            <w:r>
+              <w:t>Tesseract is our reproduced-pretrained-method requirement; bge-m3 is the smallest good multilingual embedding that actually covers Bengali. Cost: no learned layout model means no true multi-column support if a future book needs it. Would change for a corpus speciality of degraded scans (justifies a learned enhancer) or real multi-column layout.</w:t>
             </w:r>
           </w:p>
         </w:tc>
@@ -2632,18 +2377,8 @@
             <w:tcW w:type="dxa" w:w="3400"/>
           </w:tcPr>
           <w:p>
-            <w:pPr>
-              <w:spacing w:after="80"/>
-            </w:pPr>
-            <w:r>
-              <w:rPr>
-                <w:i/>
-                <w:iCs/>
-                <w:color w:val="595959"/>
-                <w:sz w:val="18"/>
-                <w:szCs w:val="18"/>
-              </w:rPr>
-              <w:t xml:space="preserve">fine-tuning / inference technique, key hyperparameters</w:t>
+            <w:r>
+              <w:t>Whole-page OCR at PSM 3, chosen over block segmentation after a held-out CER A/B (0.184 vs 0.483); entry-aware chunking keyed on remedy-alias markers with a 512/64-token fallback window.</w:t>
             </w:r>
           </w:p>
         </w:tc>
@@ -2652,18 +2387,8 @@
             <w:tcW w:type="dxa" w:w="3760"/>
           </w:tcPr>
           <w:p>
-            <w:pPr>
-              <w:spacing w:after="80"/>
-            </w:pPr>
-            <w:r>
-              <w:rPr>
-                <w:i/>
-                <w:iCs/>
-                <w:color w:val="595959"/>
-                <w:sz w:val="18"/>
-                <w:szCs w:val="18"/>
-              </w:rPr>
-              <w:t xml:space="preserve">why this · its cost · what would change our mind</w:t>
+            <w:r>
+              <w:t>The A/B test is the actual justification -- block segmentation measurably hurt accuracy on this single-column corpus. Cost: we lose the heading/body region tags block-mode would have given entry-aware chunking, recovered instead via remedy-marker detection at chunk time. Would change back to block mode for a corpus with real multi-column/footnote structure.</w:t>
             </w:r>
           </w:p>
         </w:tc>
@@ -2687,18 +2412,8 @@
             <w:tcW w:type="dxa" w:w="3400"/>
           </w:tcPr>
           <w:p>
-            <w:pPr>
-              <w:spacing w:after="80"/>
-            </w:pPr>
-            <w:r>
-              <w:rPr>
-                <w:i/>
-                <w:iCs/>
-                <w:color w:val="595959"/>
-                <w:sz w:val="18"/>
-                <w:szCs w:val="18"/>
-              </w:rPr>
-              <w:t xml:space="preserve">how the stages connect (the data contracts)</w:t>
+            <w:r>
+              <w:t>Fixed Page -&gt; Region -&gt; Chunk data contracts (contracts.py) carry page_id/doc_id/ocr_conf end-to-end so every stage -- and every future A3 citation -- can trace back to a scanned page.</w:t>
             </w:r>
           </w:p>
         </w:tc>
@@ -2707,18 +2422,8 @@
             <w:tcW w:type="dxa" w:w="3760"/>
           </w:tcPr>
           <w:p>
-            <w:pPr>
-              <w:spacing w:after="80"/>
-            </w:pPr>
-            <w:r>
-              <w:rPr>
-                <w:i/>
-                <w:iCs/>
-                <w:color w:val="595959"/>
-                <w:sz w:val="18"/>
-                <w:szCs w:val="18"/>
-              </w:rPr>
-              <w:t xml:space="preserve">why this · its cost · what would change our mind</w:t>
+            <w:r>
+              <w:t>This is what makes citation possible at all, and it's CI-enforced (test_contracts.py) so it can't silently drift. Cost: new metadata (e.g. remedy_ids as a first-class field) needs a contract change, deliberately friction-full. Would change if A3 grounding needs a field the current contract doesn't carry.</w:t>
             </w:r>
           </w:p>
         </w:tc>
@@ -2742,18 +2447,8 @@
             <w:tcW w:type="dxa" w:w="3400"/>
           </w:tcPr>
           <w:p>
-            <w:pPr>
-              <w:spacing w:after="80"/>
-            </w:pPr>
-            <w:r>
-              <w:rPr>
-                <w:i/>
-                <w:iCs/>
-                <w:color w:val="595959"/>
-                <w:sz w:val="18"/>
-                <w:szCs w:val="18"/>
-              </w:rPr>
-              <w:t xml:space="preserve">tests, config, experiment logging</w:t>
+            <w:r>
+              <w:t>Held-out CER used as the deciding metric for every OCR/layout choice; two real regressions (DPI loss, TSV quote-swallowing) were caught by this harness before shipping, not after.</w:t>
             </w:r>
           </w:p>
         </w:tc>
@@ -2762,18 +2457,8 @@
             <w:tcW w:type="dxa" w:w="3760"/>
           </w:tcPr>
           <w:p>
-            <w:pPr>
-              <w:spacing w:after="80"/>
-            </w:pPr>
-            <w:r>
-              <w:rPr>
-                <w:i/>
-                <w:iCs/>
-                <w:color w:val="595959"/>
-                <w:sz w:val="18"/>
-                <w:szCs w:val="18"/>
-              </w:rPr>
-              <w:t xml:space="preserve">why this · its cost · what would change our mind</w:t>
+            <w:r>
+              <w:t>Measuring against the real held-out set -- not eyeballing OCR text -- is what caught both bugs; byte-identical output disproved a wrong hypothesis (DPI) before we shipped a fix that didn't work. Cost: this loop is slow (Tesseract per-page, no GPU) -- minutes per comparison. Would change with a faster/cached harness for A3-scale iteration.</w:t>
             </w:r>
           </w:p>
         </w:tc>
@@ -2797,18 +2482,8 @@
             <w:tcW w:type="dxa" w:w="3400"/>
           </w:tcPr>
           <w:p>
-            <w:pPr>
-              <w:spacing w:after="80"/>
-            </w:pPr>
-            <w:r>
-              <w:rPr>
-                <w:i/>
-                <w:iCs/>
-                <w:color w:val="595959"/>
-                <w:sz w:val="18"/>
-                <w:szCs w:val="18"/>
-              </w:rPr>
-              <w:t xml:space="preserve">how indexing runs (batch, device, memory)</w:t>
+            <w:r>
+              <w:t>OCR/layout/chunk run CPU-only; embedding runs GPU (fp16) when available and falls back to CPU automatically; index build is a single batch job (scripts/build_index.sh), not incremental yet.</w:t>
             </w:r>
           </w:p>
         </w:tc>
@@ -2817,18 +2492,8 @@
             <w:tcW w:type="dxa" w:w="3760"/>
           </w:tcPr>
           <w:p>
-            <w:pPr>
-              <w:spacing w:after="80"/>
-            </w:pPr>
-            <w:r>
-              <w:rPr>
-                <w:i/>
-                <w:iCs/>
-                <w:color w:val="595959"/>
-                <w:sz w:val="18"/>
-                <w:szCs w:val="18"/>
-              </w:rPr>
-              <w:t xml:space="preserve">why this · its cost · what would change our mind</w:t>
+            <w:r>
+              <w:t>Matches our corpus size and Kaggle's free-tier T4 GPU; CPU-only OCR means the KB can still be rebuilt on a machine with no GPU, just slower. Cost: full rebuilds are all-or-nothing -- no incremental re-index yet. Would change if the corpus grew large enough that a full rebuild became too slow to iterate on.</w:t>
             </w:r>
           </w:p>
         </w:tc>
@@ -2852,18 +2517,8 @@
             <w:tcW w:type="dxa" w:w="3400"/>
           </w:tcPr>
           <w:p>
-            <w:pPr>
-              <w:spacing w:after="80"/>
-            </w:pPr>
-            <w:r>
-              <w:rPr>
-                <w:i/>
-                <w:iCs/>
-                <w:color w:val="595959"/>
-                <w:sz w:val="18"/>
-                <w:szCs w:val="18"/>
-              </w:rPr>
-              <w:t xml:space="preserve">corpus versioning, what you'd monitor</w:t>
+            <w:r>
+              <w:t>Raw/interim data gitignored and re-fetchable via scripts/get_data.sh + data/provenance.md; preprocessing/OCR caches are fingerprinted on config so they auto-invalidate; every design decision and its measured evidence is logged in configs/design_choices.md and reports/pipeline_diagram.md.</w:t>
             </w:r>
           </w:p>
         </w:tc>
@@ -2872,18 +2527,8 @@
             <w:tcW w:type="dxa" w:w="3760"/>
           </w:tcPr>
           <w:p>
-            <w:pPr>
-              <w:spacing w:after="80"/>
-            </w:pPr>
-            <w:r>
-              <w:rPr>
-                <w:i/>
-                <w:iCs/>
-                <w:color w:val="595959"/>
-                <w:sz w:val="18"/>
-                <w:szCs w:val="18"/>
-              </w:rPr>
-              <w:t xml:space="preserve">why this · its cost · what would change our mind</w:t>
+            <w:r>
+              <w:t>Keeps the repo small and reproducible from source instead of shipping large binaries; fingerprinted caching means nobody has to remember to manually clear stale OCR output after a config change -- a mistake we were otherwise exposed to, given how much OCR config we've already tuned. Would change to add index versioning/monitoring once the KB is served in A4.</w:t>
             </w:r>
           </w:p>
         </w:tc>

</xml_diff>

<commit_message>
A2: filled some form info
</commit_message>
<xml_diff>
--- a/forms/A2_form.docx
+++ b/forms/A2_form.docx
@@ -1,6 +1,6 @@
 
 <file path=word/document.xml><?xml version="1.0" encoding="utf-8"?>
-<w:document xmlns:wpc="http://schemas.microsoft.com/office/word/2010/wordprocessingCanvas" xmlns:cx="http://schemas.microsoft.com/office/drawing/2014/chartex" xmlns:cx1="http://schemas.microsoft.com/office/drawing/2015/9/8/chartex" xmlns:cx2="http://schemas.microsoft.com/office/drawing/2015/10/21/chartex" xmlns:cx3="http://schemas.microsoft.com/office/drawing/2016/5/9/chartex" xmlns:cx4="http://schemas.microsoft.com/office/drawing/2016/5/10/chartex" xmlns:cx5="http://schemas.microsoft.com/office/drawing/2016/5/11/chartex" xmlns:cx6="http://schemas.microsoft.com/office/drawing/2016/5/12/chartex" xmlns:cx7="http://schemas.microsoft.com/office/drawing/2016/5/13/chartex" xmlns:cx8="http://schemas.microsoft.com/office/drawing/2016/5/14/chartex" xmlns:mc="http://schemas.openxmlformats.org/markup-compatibility/2006" xmlns:aink="http://schemas.microsoft.com/office/drawing/2016/ink" xmlns:am3d="http://schemas.microsoft.com/office/drawing/2017/model3d" xmlns:o="urn:schemas-microsoft-com:office:office" xmlns:r="http://schemas.openxmlformats.org/officeDocument/2006/relationships" xmlns:m="http://schemas.openxmlformats.org/officeDocument/2006/math" xmlns:v="urn:schemas-microsoft-com:vml" xmlns:wp14="http://schemas.microsoft.com/office/word/2010/wordprocessingDrawing" xmlns:wp="http://schemas.openxmlformats.org/drawingml/2006/wordprocessingDrawing" xmlns:w10="urn:schemas-microsoft-com:office:word" xmlns:w="http://schemas.openxmlformats.org/wordprocessingml/2006/main" xmlns:w14="http://schemas.microsoft.com/office/word/2010/wordml" xmlns:w15="http://schemas.microsoft.com/office/word/2012/wordml" xmlns:w16cex="http://schemas.microsoft.com/office/word/2018/wordml/cex" xmlns:w16cid="http://schemas.microsoft.com/office/word/2016/wordml/cid" xmlns:w16="http://schemas.microsoft.com/office/word/2018/wordml" xmlns:w16sdtdh="http://schemas.microsoft.com/office/word/2020/wordml/sdtdatahash" xmlns:w16se="http://schemas.microsoft.com/office/word/2015/wordml/symex" xmlns:wpg="http://schemas.microsoft.com/office/word/2010/wordprocessingGroup" xmlns:wpi="http://schemas.microsoft.com/office/word/2010/wordprocessingInk" xmlns:wne="http://schemas.microsoft.com/office/word/2006/wordml" xmlns:wps="http://schemas.microsoft.com/office/word/2010/wordprocessingShape" mc:Ignorable="w14 w15 w16se w16cid w16 w16cex w16sdtdh wp14">
+<w:document xmlns:wpc="http://schemas.microsoft.com/office/word/2010/wordprocessingCanvas" xmlns:cx="http://schemas.microsoft.com/office/drawing/2014/chartex" xmlns:cx1="http://schemas.microsoft.com/office/drawing/2015/9/8/chartex" xmlns:cx2="http://schemas.microsoft.com/office/drawing/2015/10/21/chartex" xmlns:cx3="http://schemas.microsoft.com/office/drawing/2016/5/9/chartex" xmlns:cx4="http://schemas.microsoft.com/office/drawing/2016/5/10/chartex" xmlns:cx5="http://schemas.microsoft.com/office/drawing/2016/5/11/chartex" xmlns:cx6="http://schemas.microsoft.com/office/drawing/2016/5/12/chartex" xmlns:cx7="http://schemas.microsoft.com/office/drawing/2016/5/13/chartex" xmlns:cx8="http://schemas.microsoft.com/office/drawing/2016/5/14/chartex" xmlns:mc="http://schemas.openxmlformats.org/markup-compatibility/2006" xmlns:aink="http://schemas.microsoft.com/office/drawing/2016/ink" xmlns:am3d="http://schemas.microsoft.com/office/drawing/2017/model3d" xmlns:o="urn:schemas-microsoft-com:office:office" xmlns:oel="http://schemas.microsoft.com/office/2019/extlst" xmlns:r="http://schemas.openxmlformats.org/officeDocument/2006/relationships" xmlns:m="http://schemas.openxmlformats.org/officeDocument/2006/math" xmlns:v="urn:schemas-microsoft-com:vml" xmlns:wp14="http://schemas.microsoft.com/office/word/2010/wordprocessingDrawing" xmlns:wp="http://schemas.openxmlformats.org/drawingml/2006/wordprocessingDrawing" xmlns:w10="urn:schemas-microsoft-com:office:word" xmlns:w="http://schemas.openxmlformats.org/wordprocessingml/2006/main" xmlns:w14="http://schemas.microsoft.com/office/word/2010/wordml" xmlns:w15="http://schemas.microsoft.com/office/word/2012/wordml" xmlns:w16cei="http://schemas.microsoft.com/office/word/2026/wordml/cei" xmlns:w16cex="http://schemas.microsoft.com/office/word/2018/wordml/cex" xmlns:w16cid="http://schemas.microsoft.com/office/word/2016/wordml/cid" xmlns:w16="http://schemas.microsoft.com/office/word/2018/wordml" xmlns:w16du="http://schemas.microsoft.com/office/word/2023/wordml/word16du" xmlns:w16sdtdh="http://schemas.microsoft.com/office/word/2020/wordml/sdtdatahash" xmlns:w16sdtfl="http://schemas.microsoft.com/office/word/2024/wordml/sdtformatlock" xmlns:w16se="http://schemas.microsoft.com/office/word/2015/wordml/symex" xmlns:wpg="http://schemas.microsoft.com/office/word/2010/wordprocessingGroup" xmlns:wpi="http://schemas.microsoft.com/office/word/2010/wordprocessingInk" xmlns:wne="http://schemas.microsoft.com/office/word/2006/wordml" xmlns:wps="http://schemas.microsoft.com/office/word/2010/wordprocessingShape" mc:Ignorable="w14 w15 w16se w16cid w16 w16cex w16sdtdh w16sdtfl w16du wp14">
   <w:body>
     <w:p>
       <w:pPr>
@@ -53,12 +53,6 @@
         <w:gridCol w:w="9360"/>
       </w:tblGrid>
       <w:tr>
-        <w:tblPrEx>
-          <w:tblCellMar>
-            <w:top w:w="0" w:type="dxa"/>
-            <w:bottom w:w="0" w:type="dxa"/>
-          </w:tblCellMar>
-        </w:tblPrEx>
         <w:tc>
           <w:tcPr>
             <w:tcW w:w="9360" w:type="dxa"/>
@@ -109,12 +103,6 @@
         <w:gridCol w:w="5860"/>
       </w:tblGrid>
       <w:tr>
-        <w:tblPrEx>
-          <w:tblCellMar>
-            <w:top w:w="0" w:type="dxa"/>
-            <w:bottom w:w="0" w:type="dxa"/>
-          </w:tblCellMar>
-        </w:tblPrEx>
         <w:tc>
           <w:tcPr>
             <w:tcW w:w="3500" w:type="dxa"/>
@@ -213,12 +201,6 @@
         <w:gridCol w:w="2300"/>
       </w:tblGrid>
       <w:tr>
-        <w:tblPrEx>
-          <w:tblCellMar>
-            <w:top w:w="0" w:type="dxa"/>
-            <w:bottom w:w="0" w:type="dxa"/>
-          </w:tblCellMar>
-        </w:tblPrEx>
         <w:trPr>
           <w:tblHeader/>
         </w:trPr>
@@ -300,12 +282,6 @@
         </w:tc>
       </w:tr>
       <w:tr>
-        <w:tblPrEx>
-          <w:tblCellMar>
-            <w:top w:w="0" w:type="dxa"/>
-            <w:bottom w:w="0" w:type="dxa"/>
-          </w:tblCellMar>
-        </w:tblPrEx>
         <w:tc>
           <w:tcPr>
             <w:tcW w:w="1700" w:type="dxa"/>
@@ -357,12 +333,6 @@
         </w:tc>
       </w:tr>
       <w:tr>
-        <w:tblPrEx>
-          <w:tblCellMar>
-            <w:top w:w="0" w:type="dxa"/>
-            <w:bottom w:w="0" w:type="dxa"/>
-          </w:tblCellMar>
-        </w:tblPrEx>
         <w:tc>
           <w:tcPr>
             <w:tcW w:w="1700" w:type="dxa"/>
@@ -410,16 +380,13 @@
             <w:pPr>
               <w:spacing w:after="80"/>
             </w:pPr>
-          </w:p>
-        </w:tc>
-      </w:tr>
-      <w:tr>
-        <w:tblPrEx>
-          <w:tblCellMar>
-            <w:top w:w="0" w:type="dxa"/>
-            <w:bottom w:w="0" w:type="dxa"/>
-          </w:tblCellMar>
-        </w:tblPrEx>
+            <w:r>
+              <w:t>Tesseract OCR setup, notebooks, sandbox testing</w:t>
+            </w:r>
+          </w:p>
+        </w:tc>
+      </w:tr>
+      <w:tr>
         <w:tc>
           <w:tcPr>
             <w:tcW w:w="1700" w:type="dxa"/>
@@ -497,12 +464,6 @@
         <w:gridCol w:w="9360"/>
       </w:tblGrid>
       <w:tr>
-        <w:tblPrEx>
-          <w:tblCellMar>
-            <w:top w:w="0" w:type="dxa"/>
-            <w:bottom w:w="0" w:type="dxa"/>
-          </w:tblCellMar>
-        </w:tblPrEx>
         <w:tc>
           <w:tcPr>
             <w:tcW w:w="9360" w:type="dxa"/>
@@ -520,10 +481,7 @@
               <w:t xml:space="preserve">What this assignment is: </w:t>
             </w:r>
             <w:r>
-              <w:t>You BUILD the knowledge base — the front half of the pipeline that turns scanned pages into searchable text: ingest &amp; clean the scans, (optionally) enhance them, detect layout, run OCR, then chunk, embe</w:t>
-            </w:r>
-            <w:r>
-              <w:t>d, and index. You choose the models and parameters; the repo fixes where each piece goes. This milestone produces working code and evidence it reads and retrieves.</w:t>
+              <w:t>You BUILD the knowledge base — the front half of the pipeline that turns scanned pages into searchable text: ingest &amp; clean the scans, (optionally) enhance them, detect layout, run OCR, then chunk, embed, and index. You choose the models and parameters; the repo fixes where each piece goes. This milestone produces working code and evidence it reads and retrieves.</w:t>
             </w:r>
           </w:p>
           <w:p>
@@ -538,16 +496,7 @@
               <w:t xml:space="preserve">What to hand in: </w:t>
             </w:r>
             <w:r>
-              <w:t xml:space="preserve">Push everything to your team's PUBLIC GitHub repo, then tag it: git add -A </w:t>
-            </w:r>
-            <w:r>
-              <w:t>&amp;&amp; git commit -m "a2-submit" &amp;&amp; git tag a2-submit &amp;&amp; git push origin main --tags. The tag IS your submission (deadlines are read from GitHub's servers) — do NOT upload a ZIP. Contents: the filled form in forms/, the repo with ingest / vision / index stages</w:t>
-            </w:r>
-            <w:r>
-              <w:t xml:space="preserve"> implemented, the built index (or a script that builds it), notebooks/kb_demo.ipynb showing OCR quality and one retrieval example, your updated configs/design_choices.md, and one AI-chat transcript per member. ALSO CARRIED FORWARD FROM A1 — the code stub w</w:t>
-            </w:r>
-            <w:r>
-              <w:t>as released after A1, so these are graded here for the first time: configs/task.yaml, data/provenance.md plus your corpus (or scripts/get_data.sh), notebooks/eda.ipynb, grading_kit/manifest.yaml, and grading_kit/heldout_pages/ with labels.jsonl.</w:t>
+              <w:t>Push everything to your team's PUBLIC GitHub repo, then tag it: git add -A &amp;&amp; git commit -m "a2-submit" &amp;&amp; git tag a2-submit &amp;&amp; git push origin main --tags. The tag IS your submission (deadlines are read from GitHub's servers) — do NOT upload a ZIP. Contents: the filled form in forms/, the repo with ingest / vision / index stages implemented, the built index (or a script that builds it), notebooks/kb_demo.ipynb showing OCR quality and one retrieval example, your updated configs/design_choices.md, and one AI-chat transcript per member. ALSO CARRIED FORWARD FROM A1 — the code stub was released after A1, so these are graded here for the first time: configs/task.yaml, data/provenance.md plus your corpus (or scripts/get_data.sh), notebooks/eda.ipynb, grading_kit/manifest.yaml, and grading_kit/heldout_pages/ with labels.jsonl.</w:t>
             </w:r>
           </w:p>
         </w:tc>
@@ -604,12 +553,6 @@
         <w:gridCol w:w="5860"/>
       </w:tblGrid>
       <w:tr>
-        <w:tblPrEx>
-          <w:tblCellMar>
-            <w:top w:w="0" w:type="dxa"/>
-            <w:bottom w:w="0" w:type="dxa"/>
-          </w:tblCellMar>
-        </w:tblPrEx>
         <w:tc>
           <w:tcPr>
             <w:tcW w:w="3500" w:type="dxa"/>
@@ -649,24 +592,12 @@
           </w:tcPr>
           <w:p>
             <w:r>
-              <w:t>Domain: his</w:t>
-            </w:r>
-            <w:r>
-              <w:t>torical Bengali homeopathy home-medicine lookup (user: BHMS student / rural extension practitioner). Data speciality: code-switching -- Bangla script with transliterated Latin/Greek remedy names and Bengali potency numerals. Primary NFR: robust/reliable, o</w:t>
-            </w:r>
-            <w:r>
-              <w:t>ptimised as groundedness with 100% citation.</w:t>
-            </w:r>
-          </w:p>
-        </w:tc>
-      </w:tr>
-      <w:tr>
-        <w:tblPrEx>
-          <w:tblCellMar>
-            <w:top w:w="0" w:type="dxa"/>
-            <w:bottom w:w="0" w:type="dxa"/>
-          </w:tblCellMar>
-        </w:tblPrEx>
+              <w:t>Domain: historical Bengali homeopathy home-medicine lookup (user: BHMS student / rural extension practitioner). Data speciality: code-switching -- Bangla script with transliterated Latin/Greek remedy names and Bengali potency numerals. Primary NFR: robust/reliable, optimised as groundedness with 100% citation.</w:t>
+            </w:r>
+          </w:p>
+        </w:tc>
+      </w:tr>
+      <w:tr>
         <w:tc>
           <w:tcPr>
             <w:tcW w:w="3500" w:type="dxa"/>
@@ -706,21 +637,12 @@
           </w:tcPr>
           <w:p>
             <w:r>
-              <w:t xml:space="preserve">nfr_target (configs/task.yaml): groundedness &gt;= 0.95 and cited-answer-rate = 1.0 -- every answer carries a book+page </w:t>
-            </w:r>
-            <w:r>
-              <w:t>citation, or the system abstains. [Carry forward the exact baseline number/method from your A1 form here -- not reproduced in this draft.]</w:t>
-            </w:r>
-          </w:p>
-        </w:tc>
-      </w:tr>
-      <w:tr>
-        <w:tblPrEx>
-          <w:tblCellMar>
-            <w:top w:w="0" w:type="dxa"/>
-            <w:bottom w:w="0" w:type="dxa"/>
-          </w:tblCellMar>
-        </w:tblPrEx>
+              <w:t xml:space="preserve">nfr_target (configs/task.yaml): groundedness &gt;= 0.95 and cited-answer-rate = 1.0 -- every answer carries a book+page citation, or the system abstains. </w:t>
+            </w:r>
+          </w:p>
+        </w:tc>
+      </w:tr>
+      <w:tr>
         <w:tc>
           <w:tcPr>
             <w:tcW w:w="3500" w:type="dxa"/>
@@ -762,47 +684,19 @@
           <w:p>
             <w:r>
               <w:lastRenderedPageBreak/>
-              <w:t>Two public-domain Ben</w:t>
-            </w:r>
-            <w:r>
-              <w:t xml:space="preserve">gali homeopathy manuals from the Digital Library of India / Internet Archive: bk1 'Homeopathic Paribarik </w:t>
+              <w:t xml:space="preserve">Two public-domain Bengali homeopathy manuals from the Digital Library of India / Internet Archive: bk1 'Homeopathic Paribarik </w:t>
             </w:r>
             <w:r>
               <w:lastRenderedPageBreak/>
-              <w:t xml:space="preserve">Chikitsa' (1919, TEST/held-out) and bk2 'Homiopyathik Chikitsa Bidhan Vol.1' (1908, TRAIN). 1,107 usable scanned page-images after JP2-&gt;PNG conversion </w:t>
-            </w:r>
-            <w:r>
-              <w:t>(662 + 445; 29 non-content boundary pages -- covers/blanks/scan-cards -- failed conversion harmlessly). Split by whole book, never by page, so no page is shared across splits. Hard to read: pre-1948 orthography, conjunct/matra clusters (</w:t>
-            </w:r>
-            <w:r>
-              <w:t>যুক্তাক্ষর</w:t>
-            </w:r>
-            <w:r>
-              <w:t xml:space="preserve">), mixed </w:t>
-            </w:r>
-            <w:r>
-              <w:t>Bangla+Latin remedy names, Bengali potency numerals (</w:t>
-            </w:r>
-            <w:r>
-              <w:t>৬</w:t>
-            </w:r>
-            <w:r>
-              <w:t>/</w:t>
-            </w:r>
-            <w:r>
-              <w:t>৩০</w:t>
-            </w:r>
-            <w:r>
-              <w:t>/</w:t>
-            </w:r>
-            <w:r>
-              <w:t>২০০</w:t>
-            </w:r>
-            <w:r>
-              <w:t xml:space="preserve">). [TODO: insert exact page/word counts once notebooks/eda.ipynb is executed and grading_kit/manifest.yaml is filled -- floor is &gt;=300 pages / &gt;=60,000 words, already comfortably cleared on page </w:t>
-            </w:r>
-            <w:r>
-              <w:t>count.]</w:t>
+              <w:t xml:space="preserve">Chikitsa' (1919, TEST/held-out) and bk2 'Homiopyathik Chikitsa Bidhan Vol.1' (1908, TRAIN). 1,107 usable scanned page-images after JP2-&gt;PNG conversion (662 + 445; 29 non-content boundary pages -- covers/blanks/scan-cards -- failed conversion harmlessly). </w:t>
+            </w:r>
+          </w:p>
+          <w:p>
+            <w:r>
+              <w:t xml:space="preserve">Word count: 131993 + 80901. </w:t>
+            </w:r>
+            <w:r>
+              <w:t xml:space="preserve">Split by whole book, never by page, so no page is shared across splits. Hard to read: pre-1948 orthography, conjunct/matra clusters (যুক্তাক্ষর), mixed Bangla+Latin remedy names, Bengali potency numerals (৬/৩০/২০০). </w:t>
             </w:r>
           </w:p>
         </w:tc>
@@ -860,12 +754,6 @@
         <w:gridCol w:w="5860"/>
       </w:tblGrid>
       <w:tr>
-        <w:tblPrEx>
-          <w:tblCellMar>
-            <w:top w:w="0" w:type="dxa"/>
-            <w:bottom w:w="0" w:type="dxa"/>
-          </w:tblCellMar>
-        </w:tblPrEx>
         <w:tc>
           <w:tcPr>
             <w:tcW w:w="3500" w:type="dxa"/>
@@ -895,8 +783,43 @@
                 <w:sz w:val="18"/>
                 <w:szCs w:val="18"/>
               </w:rPr>
-              <w:t xml:space="preserve">what a vision model can exploit — nearby pixels form </w:t>
-            </w:r>
+              <w:t>what a vision model can exploit — nearby pixels form strokes/characters; a character looks the same when shifted. Drives your layout &amp; enhancement choices.</w:t>
+            </w:r>
+          </w:p>
+        </w:tc>
+        <w:tc>
+          <w:tcPr>
+            <w:tcW w:w="5860" w:type="dxa"/>
+          </w:tcPr>
+          <w:p>
+            <w:r>
+              <w:t>Pages are dominantly single-column running prose with occasional headings/footnotes in a smaller register. Characters are formed from consistent Bangla script strokes and conjunct/matra shapes that stay locally consistent regardless of where they sit on the page -- this is why whole-page OCR (below) works as well as it does on this corpus.</w:t>
+            </w:r>
+          </w:p>
+        </w:tc>
+      </w:tr>
+      <w:tr>
+        <w:tc>
+          <w:tcPr>
+            <w:tcW w:w="3500" w:type="dxa"/>
+            <w:shd w:val="clear" w:color="auto" w:fill="F2F2F2"/>
+          </w:tcPr>
+          <w:p>
+            <w:pPr>
+              <w:spacing w:after="80"/>
+            </w:pPr>
+            <w:r>
+              <w:rPr>
+                <w:b/>
+                <w:bCs/>
+              </w:rPr>
+              <w:t>Structure in the text</w:t>
+            </w:r>
+          </w:p>
+          <w:p>
+            <w:pPr>
+              <w:spacing w:after="80"/>
+            </w:pPr>
             <w:r>
               <w:rPr>
                 <w:i/>
@@ -905,7 +828,7 @@
                 <w:sz w:val="18"/>
                 <w:szCs w:val="18"/>
               </w:rPr>
-              <w:t>strokes/characters; a character looks the same when shifted. Drives your layout &amp; enhancement choices.</w:t>
+              <w:t>what a sequence model can exploit — reading order and context carry meaning; conjuncts/ligatures span characters. Drives your OCR &amp; embedding choices.</w:t>
             </w:r>
           </w:p>
         </w:tc>
@@ -915,21 +838,12 @@
           </w:tcPr>
           <w:p>
             <w:r>
-              <w:t>Pages are dominantly single-column running prose with occasional headings/footnotes in a smaller register. Characters are formed from consistent Bangla s</w:t>
-            </w:r>
-            <w:r>
-              <w:t>cript strokes and conjunct/matra shapes that stay locally consistent regardless of where they sit on the page -- this is why whole-page OCR (below) works as well as it does on this corpus.</w:t>
-            </w:r>
-          </w:p>
-        </w:tc>
-      </w:tr>
-      <w:tr>
-        <w:tblPrEx>
-          <w:tblCellMar>
-            <w:top w:w="0" w:type="dxa"/>
-            <w:bottom w:w="0" w:type="dxa"/>
-          </w:tblCellMar>
-        </w:tblPrEx>
+              <w:t>Bangla word order and remedy-entry structure are regular enough that one entry (remedy name -&gt; symptoms -&gt; potency/dose) forms a coherent local unit. Our chunking exploits this so a remedy's dose stays with its name instead of being split mid-entry by a fixed-size window.</w:t>
+            </w:r>
+          </w:p>
+        </w:tc>
+      </w:tr>
+      <w:tr>
         <w:tc>
           <w:tcPr>
             <w:tcW w:w="3500" w:type="dxa"/>
@@ -944,7 +858,7 @@
                 <w:b/>
                 <w:bCs/>
               </w:rPr>
-              <w:t>Structure in the text</w:t>
+              <w:t>What should NOT change the answer</w:t>
             </w:r>
           </w:p>
           <w:p>
@@ -959,7 +873,7 @@
                 <w:sz w:val="18"/>
                 <w:szCs w:val="18"/>
               </w:rPr>
-              <w:t>what a sequence model can exploit — reading order and context carry meaning; conjuncts/ligatures span characters. Drives your OCR &amp; embedding choices.</w:t>
+              <w:t>variations the system must be robust to — page position, font, mild skew, scan noise, ink bleed. Knowing these points you to the right model and augmentation.</w:t>
             </w:r>
           </w:p>
         </w:tc>
@@ -969,64 +883,7 @@
           </w:tcPr>
           <w:p>
             <w:r>
-              <w:t>Bangla word order and remedy-entry structure are regular enough that one entry (remedy name -&gt; symptoms -</w:t>
-            </w:r>
-            <w:r>
-              <w:t>&gt; potency/dose) forms a coherent local unit. Our chunking exploits this so a remedy's dose stays with its name instead of being split mid-entry by a fixed-size window.</w:t>
-            </w:r>
-          </w:p>
-        </w:tc>
-      </w:tr>
-      <w:tr>
-        <w:tblPrEx>
-          <w:tblCellMar>
-            <w:top w:w="0" w:type="dxa"/>
-            <w:bottom w:w="0" w:type="dxa"/>
-          </w:tblCellMar>
-        </w:tblPrEx>
-        <w:tc>
-          <w:tcPr>
-            <w:tcW w:w="3500" w:type="dxa"/>
-            <w:shd w:val="clear" w:color="auto" w:fill="F2F2F2"/>
-          </w:tcPr>
-          <w:p>
-            <w:pPr>
-              <w:spacing w:after="80"/>
-            </w:pPr>
-            <w:r>
-              <w:rPr>
-                <w:b/>
-                <w:bCs/>
-              </w:rPr>
-              <w:t>What should NOT change the answer</w:t>
-            </w:r>
-          </w:p>
-          <w:p>
-            <w:pPr>
-              <w:spacing w:after="80"/>
-            </w:pPr>
-            <w:r>
-              <w:rPr>
-                <w:i/>
-                <w:iCs/>
-                <w:color w:val="595959"/>
-                <w:sz w:val="18"/>
-                <w:szCs w:val="18"/>
-              </w:rPr>
-              <w:t>variations the system must be robust to — page position, font, mild skew, scan noise, ink bleed. Knowing these points you to the right model and augmentation.</w:t>
-            </w:r>
-          </w:p>
-        </w:tc>
-        <w:tc>
-          <w:tcPr>
-            <w:tcW w:w="5860" w:type="dxa"/>
-          </w:tcPr>
-          <w:p>
-            <w:r>
-              <w:t>Page position/order, exact font weight, mild skew/foxing, and OCR engine minor-version should not</w:t>
-            </w:r>
-            <w:r>
-              <w:t xml:space="preserve"> change which remedy/page gets retrieved or cited -- this is exactly what the code-switching speciality and the whole-page-OCR A/B test (Section 3) were measured against.</w:t>
+              <w:t>Page position/order, exact font weight, mild skew/foxing, and OCR engine minor-version should not change which remedy/page gets retrieved or cited -- this is exactly what the code-switching speciality and the whole-page-OCR A/B test (Section 3) were measured against.</w:t>
             </w:r>
           </w:p>
         </w:tc>
@@ -1051,10 +908,7 @@
         <w:spacing w:after="100"/>
       </w:pPr>
       <w:r>
-        <w:t xml:space="preserve">For each stage, name the options you </w:t>
-      </w:r>
-      <w:r>
-        <w:t xml:space="preserve">compared and your choice. </w:t>
+        <w:t xml:space="preserve">For each stage, name the options you compared and your choice. </w:t>
       </w:r>
       <w:r>
         <w:rPr>
@@ -1064,10 +918,7 @@
         <w:t>At least one choice must be an existing published/pretrained method you reproduce and adapt</w:t>
       </w:r>
       <w:r>
-        <w:t xml:space="preserve"> (your OCR foundation is the natural one — reproducing someone else's method is the core skill for adopting whatever comes next). Mark it i</w:t>
-      </w:r>
-      <w:r>
-        <w:t>n the last column.</w:t>
+        <w:t xml:space="preserve"> (your OCR foundation is the natural one — reproducing someone else's method is the core skill for adopting whatever comes next). Mark it in the last column.</w:t>
       </w:r>
     </w:p>
     <w:tbl>
@@ -1094,12 +945,6 @@
         <w:gridCol w:w="1842"/>
       </w:tblGrid>
       <w:tr>
-        <w:tblPrEx>
-          <w:tblCellMar>
-            <w:top w:w="0" w:type="dxa"/>
-            <w:bottom w:w="0" w:type="dxa"/>
-          </w:tblCellMar>
-        </w:tblPrEx>
         <w:trPr>
           <w:tblHeader/>
         </w:trPr>
@@ -1181,12 +1026,6 @@
         </w:tc>
       </w:tr>
       <w:tr>
-        <w:tblPrEx>
-          <w:tblCellMar>
-            <w:top w:w="0" w:type="dxa"/>
-            <w:bottom w:w="0" w:type="dxa"/>
-          </w:tblCellMar>
-        </w:tblPrEx>
         <w:tc>
           <w:tcPr>
             <w:tcW w:w="1700" w:type="dxa"/>
@@ -1216,10 +1055,7 @@
           </w:tcPr>
           <w:p>
             <w:r>
-              <w:t xml:space="preserve">None -- enhance.enabled: false. Our data speciality is </w:t>
-            </w:r>
-            <w:r>
-              <w:t>code-switching, not physically degraded scans, so a learned cleanup model wasn't justified; classical preprocessing (passthrough + autocontrast) already covers our actual failure mode.</w:t>
+              <w:t>None -- enhance.enabled: false. Our data speciality is code-switching, not physically degraded scans, so a learned cleanup model wasn't justified; classical preprocessing (passthrough + autocontrast) already covers our actual failure mode.</w:t>
             </w:r>
           </w:p>
         </w:tc>
@@ -1235,12 +1071,6 @@
         </w:tc>
       </w:tr>
       <w:tr>
-        <w:tblPrEx>
-          <w:tblCellMar>
-            <w:top w:w="0" w:type="dxa"/>
-            <w:bottom w:w="0" w:type="dxa"/>
-          </w:tblCellMar>
-        </w:tblPrEx>
         <w:tc>
           <w:tcPr>
             <w:tcW w:w="1700" w:type="dxa"/>
@@ -1250,8 +1080,67 @@
               <w:spacing w:after="80"/>
             </w:pPr>
             <w:r>
+              <w:t>Layout detection</w:t>
+            </w:r>
+          </w:p>
+        </w:tc>
+        <w:tc>
+          <w:tcPr>
+            <w:tcW w:w="2900" w:type="dxa"/>
+          </w:tcPr>
+          <w:p>
+            <w:r>
+              <w:t xml:space="preserve">Tesseract block-segmentation (group word-boxes into heading/body regions) vs </w:t>
+            </w:r>
+            <w:r>
               <w:lastRenderedPageBreak/>
-              <w:t>Layout detection</w:t>
+              <w:t>whole-page (one full-page region per page)</w:t>
+            </w:r>
+          </w:p>
+        </w:tc>
+        <w:tc>
+          <w:tcPr>
+            <w:tcW w:w="3200" w:type="dxa"/>
+          </w:tcPr>
+          <w:p>
+            <w:r>
+              <w:lastRenderedPageBreak/>
+              <w:t xml:space="preserve">Whole-page (layout.mode: whole_page). Measured on the 30-page bk1 held-out set: block mean </w:t>
+            </w:r>
+            <w:r>
+              <w:lastRenderedPageBreak/>
+              <w:t>CER 0.483 vs whole-page 0.184. Block segmentation caused catastrophic mis-segmentation on ~9 pages (up to CER 5.69) with no benefit on this single-column corpus.</w:t>
+            </w:r>
+          </w:p>
+        </w:tc>
+        <w:tc>
+          <w:tcPr>
+            <w:tcW w:w="1560" w:type="dxa"/>
+          </w:tcPr>
+          <w:p>
+            <w:r>
+              <w:lastRenderedPageBreak/>
+              <w:t xml:space="preserve">No -- heuristic Tesseract word-box grouping, not a </w:t>
+            </w:r>
+            <w:r>
+              <w:lastRenderedPageBreak/>
+              <w:t>trained detection model</w:t>
+            </w:r>
+          </w:p>
+        </w:tc>
+      </w:tr>
+      <w:tr>
+        <w:tc>
+          <w:tcPr>
+            <w:tcW w:w="1700" w:type="dxa"/>
+          </w:tcPr>
+          <w:p>
+            <w:pPr>
+              <w:spacing w:after="80"/>
+            </w:pPr>
+            <w:r>
+              <w:lastRenderedPageBreak/>
+              <w:t>OCR / HTR</w:t>
             </w:r>
           </w:p>
         </w:tc>
@@ -1261,10 +1150,7 @@
           </w:tcPr>
           <w:p>
             <w:r>
-              <w:t xml:space="preserve">Tesseract </w:t>
-            </w:r>
-            <w:r>
-              <w:t>block-segmentation (group word-boxes into heading/body regions) vs whole-page (one full-page region per page)</w:t>
+              <w:t>Tesseract 5 (ben+eng) vs a Bangla-capable neural OCR (Surya / a bn TrOCR checkpoint)</w:t>
             </w:r>
           </w:p>
         </w:tc>
@@ -1274,10 +1160,7 @@
           </w:tcPr>
           <w:p>
             <w:r>
-              <w:t>Whole-page (layout.mode: whole_page). Measured on the 30-page bk1 held-out set: block mean CER 0.483 vs whole-page 0.184. Block segmentation cause</w:t>
-            </w:r>
-            <w:r>
-              <w:t>d catastrophic mis-segmentation on ~9 pages (up to CER 5.69) with no benefit on this single-column corpus.</w:t>
+              <w:t>Tesseract 5 baseline, whole-page pass at --psm 3. Two bugs fixed while measuring: (1) whole-page regions now OCR the original page image directly -- a re-saved crop dropped scan DPI and broke PSM-3 segmentation on sparse pages; (2) the TSV parser now uses csv.QUOTE_NONE -- a stray " in OCR'd text was otherwise read as a CSV quote and silently swallowed following rows, inflating 5 pages to CER 3-4x. Final held-out mean CER 0.184 (target &lt;=0.15, not yet met). Neural fallback for low-confidence pages is planned, not yet implemented (ocr.fallback is empty).</w:t>
             </w:r>
           </w:p>
         </w:tc>
@@ -1287,18 +1170,12 @@
           </w:tcPr>
           <w:p>
             <w:r>
-              <w:t>No -- heuristic Tesseract word-box grouping, not a trained detection model</w:t>
-            </w:r>
-          </w:p>
-        </w:tc>
-      </w:tr>
-      <w:tr>
-        <w:tblPrEx>
-          <w:tblCellMar>
-            <w:top w:w="0" w:type="dxa"/>
-            <w:bottom w:w="0" w:type="dxa"/>
-          </w:tblCellMar>
-        </w:tblPrEx>
+              <w:t>Yes -- pretrained Tesseract 5 ben+eng model, reproduced as our OCR baseline</w:t>
+            </w:r>
+          </w:p>
+        </w:tc>
+      </w:tr>
+      <w:tr>
         <w:tc>
           <w:tcPr>
             <w:tcW w:w="1700" w:type="dxa"/>
@@ -1308,7 +1185,7 @@
               <w:spacing w:after="80"/>
             </w:pPr>
             <w:r>
-              <w:t>OCR / HTR</w:t>
+              <w:t>Chunking</w:t>
             </w:r>
           </w:p>
         </w:tc>
@@ -1318,10 +1195,7 @@
           </w:tcPr>
           <w:p>
             <w:r>
-              <w:t>Tesseract 5 (ben+eng) vs a Bangla-capable neural OCR (Surya / a</w:t>
-            </w:r>
-            <w:r>
-              <w:t xml:space="preserve"> bn TrOCR checkpoint)</w:t>
+              <w:t>Fixed-size token windows vs semantic/entry-aware chunking</w:t>
             </w:r>
           </w:p>
         </w:tc>
@@ -1331,13 +1205,7 @@
           </w:tcPr>
           <w:p>
             <w:r>
-              <w:t>Tesseract 5 baseline, whole-page pass at --psm 3. Two bugs fixed while measuring: (1) whole-page regions now OCR the original page image directly -- a re-saved crop dropped scan DPI and broke PSM-3 segmentation on sparse pages; (2) th</w:t>
-            </w:r>
-            <w:r>
-              <w:t>e TSV parser now uses csv.QUOTE_NONE -- a stray " in OCR'd text was otherwise read as a CSV quote and silently swallowed following rows, inflating 5 pages to CER 3-4x. Final held-out mean CER 0.184 (target &lt;=0.15, not yet met). Neural fallback for low-conf</w:t>
-            </w:r>
-            <w:r>
-              <w:t>idence pages is planned, not yet implemented (ocr.fallback is empty).</w:t>
+              <w:t>Entry-aware: normalize text, mark remedy-alias occurrences (canonicalizing Bangla/Latin spelling variants, e.g. ভিরেট্রাম/Veratrum -&gt; veratrum_album), start a new chunk at each remedy marker so a remedy's symptoms/potency/dose stay together, falling back to a 512-token / 64-overlap window (bge-m3 tokenizer) only when a single entry exceeds the limit.</w:t>
             </w:r>
           </w:p>
         </w:tc>
@@ -1347,18 +1215,12 @@
           </w:tcPr>
           <w:p>
             <w:r>
-              <w:t>Yes -- pretrained Tesseract 5 ben+eng model, reproduced as our OCR baseline</w:t>
-            </w:r>
-          </w:p>
-        </w:tc>
-      </w:tr>
-      <w:tr>
-        <w:tblPrEx>
-          <w:tblCellMar>
-            <w:top w:w="0" w:type="dxa"/>
-            <w:bottom w:w="0" w:type="dxa"/>
-          </w:tblCellMar>
-        </w:tblPrEx>
+              <w:t>No -- rule-based chunking logic, not a pretrained/published method</w:t>
+            </w:r>
+          </w:p>
+        </w:tc>
+      </w:tr>
+      <w:tr>
         <w:tc>
           <w:tcPr>
             <w:tcW w:w="1700" w:type="dxa"/>
@@ -1368,7 +1230,7 @@
               <w:spacing w:after="80"/>
             </w:pPr>
             <w:r>
-              <w:t>Chunking</w:t>
+              <w:t>Embedding</w:t>
             </w:r>
           </w:p>
         </w:tc>
@@ -1378,7 +1240,7 @@
           </w:tcPr>
           <w:p>
             <w:r>
-              <w:t>Fixed-size token windows vs semantic/entry-aware chunking</w:t>
+              <w:t>BAAI/bge-m3 (multilingual) vs an English-only sentence embedding (e.g. MiniLM)</w:t>
             </w:r>
           </w:p>
         </w:tc>
@@ -1388,19 +1250,7 @@
           </w:tcPr>
           <w:p>
             <w:r>
-              <w:t>Entry-aware: normalize text, mark remedy-a</w:t>
-            </w:r>
-            <w:r>
-              <w:t xml:space="preserve">lias occurrences (canonicalizing Bangla/Latin spelling variants, e.g. </w:t>
-            </w:r>
-            <w:r>
-              <w:t>ভিরেট্রাম</w:t>
-            </w:r>
-            <w:r>
-              <w:t xml:space="preserve">/Veratrum -&gt; veratrum_album), start a new chunk at each remedy marker so a remedy's symptoms/potency/dose stay together, falling back to a 512-token / 64-overlap window (bge-m3 </w:t>
-            </w:r>
-            <w:r>
-              <w:t>tokenizer) only when a single entry exceeds the limit.</w:t>
+              <w:t>bge-m3 (dim 1024, fp16 on GPU) -- multilingual and actually covers Bengali, unlike an English-only default which would not represent Bangla or code-switched remedy names well.</w:t>
             </w:r>
           </w:p>
         </w:tc>
@@ -1410,18 +1260,12 @@
           </w:tcPr>
           <w:p>
             <w:r>
-              <w:t>No -- rule-based chunking logic, not a pretrained/published method</w:t>
-            </w:r>
-          </w:p>
-        </w:tc>
-      </w:tr>
-      <w:tr>
-        <w:tblPrEx>
-          <w:tblCellMar>
-            <w:top w:w="0" w:type="dxa"/>
-            <w:bottom w:w="0" w:type="dxa"/>
-          </w:tblCellMar>
-        </w:tblPrEx>
+              <w:t>Yes -- pretrained bge-m3 checkpoint used as-is, no fine-tuning</w:t>
+            </w:r>
+          </w:p>
+        </w:tc>
+      </w:tr>
+      <w:tr>
         <w:tc>
           <w:tcPr>
             <w:tcW w:w="1700" w:type="dxa"/>
@@ -1431,7 +1275,7 @@
               <w:spacing w:after="80"/>
             </w:pPr>
             <w:r>
-              <w:t>Embedding</w:t>
+              <w:t>Vector index</w:t>
             </w:r>
           </w:p>
         </w:tc>
@@ -1441,7 +1285,7 @@
           </w:tcPr>
           <w:p>
             <w:r>
-              <w:t>BAAI/bge-m3 (multilingual) vs an English-only sentence embedding (e.g. MiniLM)</w:t>
+              <w:t>FAISS Flat (exact) vs HNSW / IVF-PQ (approximate)</w:t>
             </w:r>
           </w:p>
         </w:tc>
@@ -1451,10 +1295,7 @@
           </w:tcPr>
           <w:p>
             <w:r>
-              <w:t xml:space="preserve">bge-m3 (dim 1024, fp16 on GPU) -- </w:t>
-            </w:r>
-            <w:r>
-              <w:t>multilingual and actually covers Bengali, unlike an English-only default which would not represent Bangla or code-switched remedy names well.</w:t>
+              <w:t>Flat -- our corpus is small (~1,100 pages), so exact search is fast enough and avoids the recall loss an approximate index trades for speed at a scale we don't need yet.</w:t>
             </w:r>
           </w:p>
         </w:tc>
@@ -1464,73 +1305,7 @@
           </w:tcPr>
           <w:p>
             <w:r>
-              <w:t>Yes -- pretrained bge-m3 checkpoint used as-is, no fine-tuning</w:t>
-            </w:r>
-          </w:p>
-        </w:tc>
-      </w:tr>
-      <w:tr>
-        <w:tblPrEx>
-          <w:tblCellMar>
-            <w:top w:w="0" w:type="dxa"/>
-            <w:bottom w:w="0" w:type="dxa"/>
-          </w:tblCellMar>
-        </w:tblPrEx>
-        <w:tc>
-          <w:tcPr>
-            <w:tcW w:w="1700" w:type="dxa"/>
-          </w:tcPr>
-          <w:p>
-            <w:pPr>
-              <w:spacing w:after="80"/>
-            </w:pPr>
-            <w:r>
-              <w:t>Vector index</w:t>
-            </w:r>
-          </w:p>
-        </w:tc>
-        <w:tc>
-          <w:tcPr>
-            <w:tcW w:w="2900" w:type="dxa"/>
-          </w:tcPr>
-          <w:p>
-            <w:r>
-              <w:t>FAISS Flat (exact) vs HNSW / IVF-PQ (</w:t>
-            </w:r>
-            <w:r>
-              <w:t>approximate)</w:t>
-            </w:r>
-          </w:p>
-        </w:tc>
-        <w:tc>
-          <w:tcPr>
-            <w:tcW w:w="3200" w:type="dxa"/>
-          </w:tcPr>
-          <w:p>
-            <w:r>
-              <w:t xml:space="preserve">Flat -- our corpus is small (~1,100 pages), so exact search is fast enough and avoids the recall loss an </w:t>
-            </w:r>
-            <w:r>
-              <w:lastRenderedPageBreak/>
-              <w:t>approximate index trades for speed at a scale we don't need yet.</w:t>
-            </w:r>
-          </w:p>
-        </w:tc>
-        <w:tc>
-          <w:tcPr>
-            <w:tcW w:w="1560" w:type="dxa"/>
-          </w:tcPr>
-          <w:p>
-            <w:r>
-              <w:lastRenderedPageBreak/>
-              <w:t xml:space="preserve">N/A -- off-the-shelf index data structure, not a </w:t>
-            </w:r>
-            <w:r>
-              <w:lastRenderedPageBreak/>
-              <w:t>learned/pretrained compo</w:t>
-            </w:r>
-            <w:r>
-              <w:t>nent</w:t>
+              <w:t>N/A -- off-the-shelf index data structure, not a learned/pretrained component</w:t>
             </w:r>
           </w:p>
         </w:tc>
@@ -1591,12 +1366,6 @@
         <w:gridCol w:w="2031"/>
       </w:tblGrid>
       <w:tr>
-        <w:tblPrEx>
-          <w:tblCellMar>
-            <w:top w:w="0" w:type="dxa"/>
-            <w:bottom w:w="0" w:type="dxa"/>
-          </w:tblCellMar>
-        </w:tblPrEx>
         <w:trPr>
           <w:tblHeader/>
         </w:trPr>
@@ -1679,12 +1448,6 @@
         </w:tc>
       </w:tr>
       <w:tr>
-        <w:tblPrEx>
-          <w:tblCellMar>
-            <w:top w:w="0" w:type="dxa"/>
-            <w:bottom w:w="0" w:type="dxa"/>
-          </w:tblCellMar>
-        </w:tblPrEx>
         <w:tc>
           <w:tcPr>
             <w:tcW w:w="1900" w:type="dxa"/>
@@ -1731,12 +1494,6 @@
         </w:tc>
       </w:tr>
       <w:tr>
-        <w:tblPrEx>
-          <w:tblCellMar>
-            <w:top w:w="0" w:type="dxa"/>
-            <w:bottom w:w="0" w:type="dxa"/>
-          </w:tblCellMar>
-        </w:tblPrEx>
         <w:tc>
           <w:tcPr>
             <w:tcW w:w="1900" w:type="dxa"/>
@@ -1783,12 +1540,6 @@
         </w:tc>
       </w:tr>
       <w:tr>
-        <w:tblPrEx>
-          <w:tblCellMar>
-            <w:top w:w="0" w:type="dxa"/>
-            <w:bottom w:w="0" w:type="dxa"/>
-          </w:tblCellMar>
-        </w:tblPrEx>
         <w:tc>
           <w:tcPr>
             <w:tcW w:w="1900" w:type="dxa"/>
@@ -1829,21 +1580,12 @@
           </w:tcPr>
           <w:p>
             <w:r>
-              <w:t xml:space="preserve">Pretrained </w:t>
-            </w:r>
-            <w:r>
-              <w:t>baseline; finetune=false -- flip to true only if CER forces it (currently 0.184 vs 0.15 target)</w:t>
-            </w:r>
-          </w:p>
-        </w:tc>
-      </w:tr>
-      <w:tr>
-        <w:tblPrEx>
-          <w:tblCellMar>
-            <w:top w:w="0" w:type="dxa"/>
-            <w:bottom w:w="0" w:type="dxa"/>
-          </w:tblCellMar>
-        </w:tblPrEx>
+              <w:t>Pretrained baseline; finetune=false -- flip to true only if CER forces it (currently 0.184 vs 0.15 target)</w:t>
+            </w:r>
+          </w:p>
+        </w:tc>
+      </w:tr>
+      <w:tr>
         <w:tc>
           <w:tcPr>
             <w:tcW w:w="1900" w:type="dxa"/>
@@ -1890,12 +1632,6 @@
         </w:tc>
       </w:tr>
       <w:tr>
-        <w:tblPrEx>
-          <w:tblCellMar>
-            <w:top w:w="0" w:type="dxa"/>
-            <w:bottom w:w="0" w:type="dxa"/>
-          </w:tblCellMar>
-        </w:tblPrEx>
         <w:tc>
           <w:tcPr>
             <w:tcW w:w="1900" w:type="dxa"/>
@@ -1942,12 +1678,6 @@
         </w:tc>
       </w:tr>
       <w:tr>
-        <w:tblPrEx>
-          <w:tblCellMar>
-            <w:top w:w="0" w:type="dxa"/>
-            <w:bottom w:w="0" w:type="dxa"/>
-          </w:tblCellMar>
-        </w:tblPrEx>
         <w:tc>
           <w:tcPr>
             <w:tcW w:w="1900" w:type="dxa"/>
@@ -1988,21 +1718,12 @@
           </w:tcPr>
           <w:p>
             <w:r>
-              <w:t>N/A -- deterministic data structure, n</w:t>
-            </w:r>
-            <w:r>
-              <w:t>ot a learned model</w:t>
-            </w:r>
-          </w:p>
-        </w:tc>
-      </w:tr>
-      <w:tr>
-        <w:tblPrEx>
-          <w:tblCellMar>
-            <w:top w:w="0" w:type="dxa"/>
-            <w:bottom w:w="0" w:type="dxa"/>
-          </w:tblCellMar>
-        </w:tblPrEx>
+              <w:t>N/A -- deterministic data structure, not a learned model</w:t>
+            </w:r>
+          </w:p>
+        </w:tc>
+      </w:tr>
+      <w:tr>
         <w:tc>
           <w:tcPr>
             <w:tcW w:w="3500" w:type="dxa"/>
@@ -2044,13 +1765,7 @@
           </w:tcPr>
           <w:p>
             <w:r>
-              <w:t>pages (data/raw/&lt;book&gt;/*.png) -&gt; preprocess (passthrough+autocontrast) -&gt; enhance (off) -&gt; layout (wh</w:t>
-            </w:r>
-            <w:r>
-              <w:t>ole-page region) -&gt; OCR (Tesseract 5 ben+eng, PSM 3, QUOTE_NONE-safe TSV) -&gt; [PII redaction hook] -&gt; chunk (entry-aware, 512/64 fallback) -&gt; [pre-index hook] -&gt; embed (bge-m3, 1024-d) -&gt; store (FAISS flat, L2-normalized). Changed from the default: layout s</w:t>
-            </w:r>
-            <w:r>
-              <w:t>witched from block-segmentation to whole-page after a measured CER regression (0.483 vs 0.184).</w:t>
+              <w:t>pages (data/raw/&lt;book&gt;/*.png) -&gt; preprocess (passthrough+autocontrast) -&gt; enhance (off) -&gt; layout (whole-page region) -&gt; OCR (Tesseract 5 ben+eng, PSM 3, QUOTE_NONE-safe TSV) -&gt; [PII redaction hook] -&gt; chunk (entry-aware, 512/64 fallback) -&gt; [pre-index hook] -&gt; embed (bge-m3, 1024-d) -&gt; store (FAISS flat, L2-normalized). Changed from the default: layout switched from block-segmentation to whole-page after a measured CER regression (0.483 vs 0.184).</w:t>
             </w:r>
           </w:p>
         </w:tc>
@@ -2107,12 +1822,6 @@
         <w:gridCol w:w="5860"/>
       </w:tblGrid>
       <w:tr>
-        <w:tblPrEx>
-          <w:tblCellMar>
-            <w:top w:w="0" w:type="dxa"/>
-            <w:bottom w:w="0" w:type="dxa"/>
-          </w:tblCellMar>
-        </w:tblPrEx>
         <w:tc>
           <w:tcPr>
             <w:tcW w:w="3500" w:type="dxa"/>
@@ -2152,31 +1861,24 @@
           </w:tcPr>
           <w:p>
             <w:r>
-              <w:t xml:space="preserve">Mean character error rate </w:t>
-            </w:r>
-            <w:r>
-              <w:t>(CER) 0.184 over the 30-page bk1 held-out set (grading_kit/heldout_pages/ + labels.jsonl), measured after fixing two bugs (DPI loss on re-saved crops; Tesseract-TSV quote-swallowing). Target from A1 was &lt;=0.15 -- not yet met. Caveat: held-out labels are cu</w:t>
-            </w:r>
-            <w:r>
-              <w:t xml:space="preserve">rrently Qwen-VLM-generated, not yet human-verified -- treat this number as provisional until spot-checked by </w:t>
-            </w:r>
-            <w:r>
-              <w:lastRenderedPageBreak/>
-              <w:t>hand. [TODO: re-run and save this measurement inside notebooks/kb_demo.ipynb before submission -- per the grading gate, a number with no notebook e</w:t>
-            </w:r>
-            <w:r>
-              <w:t>vidence scores zero.]</w:t>
-            </w:r>
-          </w:p>
-        </w:tc>
-      </w:tr>
-      <w:tr>
-        <w:tblPrEx>
-          <w:tblCellMar>
-            <w:top w:w="0" w:type="dxa"/>
-            <w:bottom w:w="0" w:type="dxa"/>
-          </w:tblCellMar>
-        </w:tblPrEx>
+              <w:t xml:space="preserve">Mean character error rate (CER) 0.184 over the 30-page bk1 held-out set (grading_kit/heldout_pages/ + labels.jsonl), measured after fixing two bugs (DPI loss on re-saved crops; Tesseract-TSV quote-swallowing). Target from A1 was &lt;=0.15 -- not yet met. </w:t>
+            </w:r>
+            <w:r>
+              <w:t>H</w:t>
+            </w:r>
+            <w:r>
+              <w:t>eld-out labels are Qwen-VLM-generated</w:t>
+            </w:r>
+            <w:r>
+              <w:t xml:space="preserve"> and</w:t>
+            </w:r>
+            <w:r>
+              <w:t xml:space="preserve"> human-verified</w:t>
+            </w:r>
+          </w:p>
+        </w:tc>
+      </w:tr>
+      <w:tr>
         <w:tc>
           <w:tcPr>
             <w:tcW w:w="3500" w:type="dxa"/>
@@ -2191,7 +1893,6 @@
                 <w:b/>
                 <w:bCs/>
               </w:rPr>
-              <w:lastRenderedPageBreak/>
               <w:t>Index statistics</w:t>
             </w:r>
           </w:p>
@@ -2217,21 +1918,18 @@
           </w:tcPr>
           <w:p>
             <w:r>
-              <w:t>Known from config: embedding dimension 1024 (BAAI/bge-m3); index type FAISS Flat. [TODO: chunks indexed, and pages/word</w:t>
-            </w:r>
-            <w:r>
-              <w:t>s indexed vs total corpus, require an actual full-corpus build -- not yet run. Fill in real numbers from notebooks/kb_demo.ipynb / grading_kit/manifest.yaml before submission; do not report estimated numbers.]</w:t>
-            </w:r>
-          </w:p>
-        </w:tc>
-      </w:tr>
-      <w:tr>
-        <w:tblPrEx>
-          <w:tblCellMar>
-            <w:top w:w="0" w:type="dxa"/>
-            <w:bottom w:w="0" w:type="dxa"/>
-          </w:tblCellMar>
-        </w:tblPrEx>
+              <w:t>Known from config: embedding dimension 1024 (BAAI/bge-m3); index type FAISS Flat.</w:t>
+            </w:r>
+            <w:r>
+              <w:t xml:space="preserve"> 2054 chunks, 445/1107 pages indexed</w:t>
+            </w:r>
+            <w:r>
+              <w:t xml:space="preserve"> </w:t>
+            </w:r>
+          </w:p>
+        </w:tc>
+      </w:tr>
+      <w:tr>
         <w:tc>
           <w:tcPr>
             <w:tcW w:w="3500" w:type="dxa"/>
@@ -2261,8 +1959,71 @@
                 <w:sz w:val="18"/>
                 <w:szCs w:val="18"/>
               </w:rPr>
-              <w:t>a real query, the top c</w:t>
-            </w:r>
+              <w:lastRenderedPageBreak/>
+              <w:t>a real query, the top chunk returned, and whether it's the right page. Show one that worked.</w:t>
+            </w:r>
+          </w:p>
+        </w:tc>
+        <w:tc>
+          <w:tcPr>
+            <w:tcW w:w="5860" w:type="dxa"/>
+          </w:tcPr>
+          <w:p>
+            <w:r>
+              <w:lastRenderedPageBreak/>
+              <w:t xml:space="preserve">Query: </w:t>
+            </w:r>
+            <w:r>
+              <w:t>veratrum album dosage for cholera</w:t>
+            </w:r>
+          </w:p>
+          <w:p>
+            <w:pPr>
+              <w:rPr>
+                <w:rFonts w:ascii="Nirmala UI" w:hAnsi="Nirmala UI" w:cs="Nirmala UI"/>
+              </w:rPr>
+            </w:pPr>
+            <w:r>
+              <w:lastRenderedPageBreak/>
+              <w:t xml:space="preserve">Top chunk: </w:t>
+            </w:r>
+            <w:r>
+              <w:rPr>
+                <w:rFonts w:ascii="Nirmala UI" w:hAnsi="Nirmala UI" w:cs="Nirmala UI"/>
+              </w:rPr>
+              <w:t>পারবারিক চিকিতসা | ভিল্লেউ-বস-আ্বাল্শ্াম ৬5 ৩০৯ ২০০ ।-_অধিক পরিমাণে চাউল-ধোয়া জলের স্তায় ভেদ ও THA; WHA VE নাড়ী ; মৃত্ররোধ ; অতিশয় পিপাসা (অধিক পরিমাণে জল পান করিলেও পিপাসার নিবৃত্তি হয় না )) ভেদের পূর্বে পেটে বেদনা ; শীতল we; চক্ষু তারা ক্ষুদ্র; হাত পায়ে খিলধর! ; লুপ প্রায় awl; Sacra ও উরুতে খিলধরা ; হৃৎপিণ্ডের ক্রিয়া wid; শারীরিক অবসন্নতা ; সর্ব শরীর শীতল ও নীলবর্ণ ; মুখমণ্ডল মলিন ও শীর্ণ; শ্বাস-প্রশ্বান ও জিহবা শীতল প্রভৃতি লক্ষণে, ভিরেট্রাম [remedy:veratrum [remedy:veratrum_album]_album] বিশ পঁচিশ মিনিট অন্তর প্রয়োগ করা যায়। আর্সেনিক [remedy:arsenic [remedy:arsenicum_album]um_album] ৬১ ৩০১ Yoo ।-ভেদ ও বমনের পরিমাপ কম) ছুনিবার পিপাস! (বিশেষতঃ শীতল জল পানে ইচ্ছা ), fea অন্ন পানেই তৃপ্তি; জলপানের অব্যবহিত পরই বমন ;? মৃত্রাবরোধ, অতিশয় অবসন্তত! ও অস্থিরতা! ; A Ae বলক্ষয়; ATS ভেদ; পাকস্থলীতে জালা; সর্বার্প শীতল ) সহসা শরীর বিবর্ণ হওয়া) নাড়ী-ক্ষীণ বা লুপ্তপ্রায় ; হস্ত-পদের BHAA অগ্রভাগের মাংস কুঞ্চিত ; বমনেচ্ছা ; বমনের পর পাকাশয়ে অগ্নিদাহবৎ জাল! ; মৃতবৎ মুখাকৃতি; ঘন ঘন কষ্টকর শ্বাসপ্রশ্বাস ; বক্ষঃস্থলে চাপবোধ 7; ভেদ ও বমনের পর হৃৎপিণ্ডের faa ভ্ররত ; স্বরভঙ্গ বা wea; খিলধরা</w:t>
+            </w:r>
+          </w:p>
+          <w:p>
+            <w:r>
+              <w:t>Result: correct page retrieved</w:t>
+            </w:r>
+          </w:p>
+        </w:tc>
+      </w:tr>
+      <w:tr>
+        <w:tc>
+          <w:tcPr>
+            <w:tcW w:w="3500" w:type="dxa"/>
+            <w:shd w:val="clear" w:color="auto" w:fill="F2F2F2"/>
+          </w:tcPr>
+          <w:p>
+            <w:pPr>
+              <w:spacing w:after="80"/>
+            </w:pPr>
+            <w:r>
+              <w:rPr>
+                <w:b/>
+                <w:bCs/>
+              </w:rPr>
+              <w:lastRenderedPageBreak/>
+              <w:t>The worst failure we saw</w:t>
+            </w:r>
+          </w:p>
+          <w:p>
+            <w:pPr>
+              <w:spacing w:after="80"/>
+            </w:pPr>
             <w:r>
               <w:rPr>
                 <w:i/>
@@ -2271,7 +2032,7 @@
                 <w:sz w:val="18"/>
                 <w:szCs w:val="18"/>
               </w:rPr>
-              <w:t>hunk returned, and whether it's the right page. Show one that worked.</w:t>
+              <w:t>where reading or retrieval failed badly, and your read on why (honest — this shapes A3).</w:t>
             </w:r>
           </w:p>
         </w:tc>
@@ -2281,70 +2042,7 @@
           </w:tcPr>
           <w:p>
             <w:r>
-              <w:t>[TODO -- not yet captured. notebooks/kb_demo.ipynb Part 2 already contains a real query ('veratrum album dosage for cholera') plus a deliberately weak/out-of-corpus query to exercise is_</w:t>
-            </w:r>
-            <w:r>
-              <w:t>weak(), but it has not been executed against a persisted index yet. Run it and paste the actual top-chunk result + whether it's the correct page here.]</w:t>
-            </w:r>
-          </w:p>
-        </w:tc>
-      </w:tr>
-      <w:tr>
-        <w:tblPrEx>
-          <w:tblCellMar>
-            <w:top w:w="0" w:type="dxa"/>
-            <w:bottom w:w="0" w:type="dxa"/>
-          </w:tblCellMar>
-        </w:tblPrEx>
-        <w:tc>
-          <w:tcPr>
-            <w:tcW w:w="3500" w:type="dxa"/>
-            <w:shd w:val="clear" w:color="auto" w:fill="F2F2F2"/>
-          </w:tcPr>
-          <w:p>
-            <w:pPr>
-              <w:spacing w:after="80"/>
-            </w:pPr>
-            <w:r>
-              <w:rPr>
-                <w:b/>
-                <w:bCs/>
-              </w:rPr>
-              <w:t>The worst failure we saw</w:t>
-            </w:r>
-          </w:p>
-          <w:p>
-            <w:pPr>
-              <w:spacing w:after="80"/>
-            </w:pPr>
-            <w:r>
-              <w:rPr>
-                <w:i/>
-                <w:iCs/>
-                <w:color w:val="595959"/>
-                <w:sz w:val="18"/>
-                <w:szCs w:val="18"/>
-              </w:rPr>
-              <w:t>where reading or retrieval failed badly, and your read on why (honest — this shapes A3).</w:t>
-            </w:r>
-          </w:p>
-        </w:tc>
-        <w:tc>
-          <w:tcPr>
-            <w:tcW w:w="5860" w:type="dxa"/>
-          </w:tcPr>
-          <w:p>
-            <w:r>
-              <w:t xml:space="preserve">Two real failures caught while measuring OCR quality: (1) Tesseract block-layout segmentation catastrophically mis-read page bk1_p186 (CER 5.694 vs 0.195 for the same </w:t>
-            </w:r>
-            <w:r>
-              <w:t>page read whole-page) -- block splitting scrambled/duplicated text on ~9 of 30 held-out pages, which is why we moved to whole-page OCR. (2) A csv-parsing bug: Tesseract's TSV output is unquoted, but Python's csv.DictReader treated a stray " inside OCR'd te</w:t>
-            </w:r>
-            <w:r>
-              <w:t>xt as a quote character and silently merged following rows into one field, inflating 5 pages to CER 3-4x (e.g. bk1_p145: 4.054) until we forced quoting=csv.QUOTE_NONE. Both are fixed and verified (in-pipeline output now matches a raw full-page OCR pass exa</w:t>
-            </w:r>
-            <w:r>
-              <w:t>ctly, delta=0.000); full read-on-why is in configs/design_choices.md (Layout/OCR rows).</w:t>
+              <w:t>Two real failures caught while measuring OCR quality: (1) Tesseract block-layout segmentation catastrophically mis-read page bk1_p186 (CER 5.694 vs 0.195 for the same page read whole-page) -- block splitting scrambled/duplicated text on ~9 of 30 held-out pages, which is why we moved to whole-page OCR. (2) A csv-parsing bug: Tesseract's TSV output is unquoted, but Python's csv.DictReader treated a stray " inside OCR'd text as a quote character and silently merged following rows into one field, inflating 5 pages to CER 3-4x (e.g. bk1_p145: 4.054) until we forced quoting=csv.QUOTE_NONE. Both are fixed and verified (in-pipeline output now matches a raw full-page OCR pass exactly, delta=0.000); full read-on-why is in configs/design_choices.md (Layout/OCR rows).</w:t>
             </w:r>
           </w:p>
         </w:tc>
@@ -2401,12 +2099,6 @@
         <w:gridCol w:w="8473"/>
       </w:tblGrid>
       <w:tr>
-        <w:tblPrEx>
-          <w:tblCellMar>
-            <w:top w:w="0" w:type="dxa"/>
-            <w:bottom w:w="0" w:type="dxa"/>
-          </w:tblCellMar>
-        </w:tblPrEx>
         <w:tc>
           <w:tcPr>
             <w:tcW w:w="3500" w:type="dxa"/>
@@ -2436,8 +2128,50 @@
                 <w:sz w:val="18"/>
                 <w:szCs w:val="18"/>
               </w:rPr>
-              <w:t xml:space="preserve">retrieval + rerank, the agent loop + </w:t>
-            </w:r>
+              <w:t>retrieval + rerank, the agent loop + tools, guardrails/HITL, grounding, evaluation — and RL/RLVR if you attempt the bonus.</w:t>
+            </w:r>
+          </w:p>
+          <w:p>
+            <w:r>
+              <w:lastRenderedPageBreak/>
+              <w:t>Carry the agent forward: in A3 it must do evidence-gated re-search (widen k on weak evidence, abstain at k_max) — the mandatory agentic behaviour, graded fail-closed in A3.</w:t>
+            </w:r>
+          </w:p>
+        </w:tc>
+        <w:tc>
+          <w:tcPr>
+            <w:tcW w:w="5860" w:type="dxa"/>
+          </w:tcPr>
+          <w:p>
+            <w:r>
+              <w:lastRenderedPageBreak/>
+              <w:t>Retrieval (dense bge-m3 similarity, k=10 default) + reranking (BAAI/bge-reranker-v2-m3, narrow top-20 to top-5) + the agent loop over the nine fixed tools (retrieve/rerank/read_page/enhance_page/extract/aggregate/cite/calculator/escalate_to_human) + grounding/citation enforcement + PII redaction + prompt-injection guardrails + human-in-the-loop escalation when no page clears the confidence threshold, then an evaluation harness (recall@k, groundedness, verifiable- and judged-question accuracy).</w:t>
+            </w:r>
+          </w:p>
+        </w:tc>
+      </w:tr>
+      <w:tr>
+        <w:tc>
+          <w:tcPr>
+            <w:tcW w:w="3500" w:type="dxa"/>
+            <w:shd w:val="clear" w:color="auto" w:fill="F2F2F2"/>
+          </w:tcPr>
+          <w:p>
+            <w:pPr>
+              <w:spacing w:after="80"/>
+            </w:pPr>
+            <w:r>
+              <w:rPr>
+                <w:b/>
+                <w:bCs/>
+              </w:rPr>
+              <w:t>Our evaluation set</w:t>
+            </w:r>
+          </w:p>
+          <w:p>
+            <w:pPr>
+              <w:spacing w:after="80"/>
+            </w:pPr>
             <w:r>
               <w:rPr>
                 <w:i/>
@@ -2446,19 +2180,7 @@
                 <w:sz w:val="18"/>
                 <w:szCs w:val="18"/>
               </w:rPr>
-              <w:t>tools, guardrails/HITL, grounding, evaluation — and RL/RLVR if you attempt the bonus.</w:t>
-            </w:r>
-          </w:p>
-          <w:p>
-            <w:r>
-              <w:t xml:space="preserve">Carry the agent forward: in A3 it must do evidence-gated re-search (widen k on </w:t>
-            </w:r>
-            <w:r>
-              <w:lastRenderedPageBreak/>
-              <w:t>weak evidence, abstain at k_max) — the mandatory agentic behaviour, graded fail-closed in A</w:t>
-            </w:r>
-            <w:r>
-              <w:t>3.</w:t>
+              <w:t>how you'll write tasks.jsonl for YOUR domain — the questions your real user would ask; include enough checkable (verifiable) items and abstention cases.</w:t>
             </w:r>
           </w:p>
         </w:tc>
@@ -2468,22 +2190,12 @@
           </w:tcPr>
           <w:p>
             <w:r>
-              <w:lastRenderedPageBreak/>
-              <w:t>Retrieval (dense bge-m3 similarity, k=10 default) + reranking (BAAI/bge-reranker-v2-m3, narrow top-20 to top-5) + the agent loop over the nine fixed tools (retrieve/rerank/read_page/enhance_page/extract/aggregate/cite/calculator/escalate_to_human) + gro</w:t>
-            </w:r>
-            <w:r>
-              <w:t>unding/citation enforcement + PII redaction + prompt-injection guardrails + human-in-the-loop escalation when no page clears the confidence threshold, then an evaluation harness (recall@k, groundedness, verifiable- and judged-question accuracy).</w:t>
-            </w:r>
-          </w:p>
-        </w:tc>
-      </w:tr>
-      <w:tr>
-        <w:tblPrEx>
-          <w:tblCellMar>
-            <w:top w:w="0" w:type="dxa"/>
-            <w:bottom w:w="0" w:type="dxa"/>
-          </w:tblCellMar>
-        </w:tblPrEx>
+              <w:t>tasks.jsonl authored from real BHMS-practitioner-style questions grounded in bk1/bk2 remedy entries: a mix of verifiable (exact-match against a known quoted dose/potency line) and judged (multi-step reasoning, LLM-judged) items, plus deliberate out-of-corpus questions whose correct answer is to abstain -- including at least one matched needs_research:true/false pair to exercise the mandatory evidence-gated re-search behaviour.</w:t>
+            </w:r>
+          </w:p>
+        </w:tc>
+      </w:tr>
+      <w:tr>
         <w:tc>
           <w:tcPr>
             <w:tcW w:w="3500" w:type="dxa"/>
@@ -2498,14 +2210,7 @@
                 <w:b/>
                 <w:bCs/>
               </w:rPr>
-              <w:t>Our evalu</w:t>
-            </w:r>
-            <w:r>
-              <w:rPr>
-                <w:b/>
-                <w:bCs/>
-              </w:rPr>
-              <w:t>ation set</w:t>
+              <w:t>Biggest risk / unknown</w:t>
             </w:r>
           </w:p>
           <w:p>
@@ -2520,7 +2225,7 @@
                 <w:sz w:val="18"/>
                 <w:szCs w:val="18"/>
               </w:rPr>
-              <w:t>how you'll write tasks.jsonl for YOUR domain — the questions your real user would ask; include enough checkable (verifiable) items and abstention cases.</w:t>
+              <w:t>the thing most likely to break in A3, and your first idea to handle it.</w:t>
             </w:r>
           </w:p>
         </w:tc>
@@ -2530,70 +2235,7 @@
           </w:tcPr>
           <w:p>
             <w:r>
-              <w:t xml:space="preserve">tasks.jsonl authored from real BHMS-practitioner-style questions grounded in bk1/bk2 remedy entries: a </w:t>
-            </w:r>
-            <w:r>
-              <w:t>mix of verifiable (exact-match against a known quoted dose/potency line) and judged (multi-step reasoning, LLM-judged) items, plus deliberate out-of-corpus questions whose correct answer is to abstain -- including at least one matched needs_research:true/f</w:t>
-            </w:r>
-            <w:r>
-              <w:t>alse pair to exercise the mandatory evidence-gated re-search behaviour.</w:t>
-            </w:r>
-          </w:p>
-        </w:tc>
-      </w:tr>
-      <w:tr>
-        <w:tblPrEx>
-          <w:tblCellMar>
-            <w:top w:w="0" w:type="dxa"/>
-            <w:bottom w:w="0" w:type="dxa"/>
-          </w:tblCellMar>
-        </w:tblPrEx>
-        <w:tc>
-          <w:tcPr>
-            <w:tcW w:w="3500" w:type="dxa"/>
-            <w:shd w:val="clear" w:color="auto" w:fill="F2F2F2"/>
-          </w:tcPr>
-          <w:p>
-            <w:pPr>
-              <w:spacing w:after="80"/>
-            </w:pPr>
-            <w:r>
-              <w:rPr>
-                <w:b/>
-                <w:bCs/>
-              </w:rPr>
-              <w:t>Biggest risk / unknown</w:t>
-            </w:r>
-          </w:p>
-          <w:p>
-            <w:pPr>
-              <w:spacing w:after="80"/>
-            </w:pPr>
-            <w:r>
-              <w:rPr>
-                <w:i/>
-                <w:iCs/>
-                <w:color w:val="595959"/>
-                <w:sz w:val="18"/>
-                <w:szCs w:val="18"/>
-              </w:rPr>
-              <w:t>the thing most likely to break in A3, and your first idea to handle it.</w:t>
-            </w:r>
-          </w:p>
-        </w:tc>
-        <w:tc>
-          <w:tcPr>
-            <w:tcW w:w="5860" w:type="dxa"/>
-          </w:tcPr>
-          <w:p>
-            <w:r>
-              <w:t xml:space="preserve">OCR CER (0.184) is still above our 0.15 target, so some fraction of retrieved </w:t>
-            </w:r>
-            <w:r>
-              <w:t>evidence will be genuinely noisy going into A3 -- if the agent grounds an answer on a mis-read remedy name or potency number, it could confidently cite a wrong page. First mitigation: keep the per-page confidence gate (conf_threshold=0.60) wired to escalat</w:t>
-            </w:r>
-            <w:r>
-              <w:t>e_to_human/abstain rather than answering off low-confidence OCR, and prioritise closing the CER gap (preprocessing tuning or the Bangla neural OCR fallback) before trusting citations at face value in A3 eval.</w:t>
+              <w:t>OCR CER (0.184) is still above our 0.15 target, so some fraction of retrieved evidence will be genuinely noisy going into A3 -- if the agent grounds an answer on a mis-read remedy name or potency number, it could confidently cite a wrong page. First mitigation: keep the per-page confidence gate (conf_threshold=0.60) wired to escalate_to_human/abstain rather than answering off low-confidence OCR, and prioritise closing the CER gap (preprocessing tuning or the Bangla neural OCR fallback) before trusting citations at face value in A3 eval.</w:t>
             </w:r>
           </w:p>
         </w:tc>
@@ -2610,15 +2252,7 @@
           <w:bCs/>
           <w:color w:val="1F3864"/>
         </w:rPr>
-        <w:t>Section 7 — Design Choices &amp; Justification (kn</w:t>
-      </w:r>
-      <w:r>
-        <w:rPr>
-          <w:b/>
-          <w:bCs/>
-          <w:color w:val="1F3864"/>
-        </w:rPr>
-        <w:t>owledge-base stages)</w:t>
+        <w:t>Section 7 — Design Choices &amp; Justification (knowledge-base stages)</w:t>
       </w:r>
     </w:p>
     <w:p>
@@ -2665,12 +2299,6 @@
         <w:gridCol w:w="3760"/>
       </w:tblGrid>
       <w:tr>
-        <w:tblPrEx>
-          <w:tblCellMar>
-            <w:top w:w="0" w:type="dxa"/>
-            <w:bottom w:w="0" w:type="dxa"/>
-          </w:tblCellMar>
-        </w:tblPrEx>
         <w:trPr>
           <w:tblHeader/>
         </w:trPr>
@@ -2727,26 +2355,12 @@
                 <w:bCs/>
                 <w:color w:val="FFFFFF"/>
               </w:rPr>
-              <w:t>Why — fits our corpus · what it costs · what would cha</w:t>
-            </w:r>
-            <w:r>
-              <w:rPr>
-                <w:b/>
-                <w:bCs/>
-                <w:color w:val="FFFFFF"/>
-              </w:rPr>
-              <w:t>nge it</w:t>
-            </w:r>
-          </w:p>
-        </w:tc>
-      </w:tr>
-      <w:tr>
-        <w:tblPrEx>
-          <w:tblCellMar>
-            <w:top w:w="0" w:type="dxa"/>
-            <w:bottom w:w="0" w:type="dxa"/>
-          </w:tblCellMar>
-        </w:tblPrEx>
+              <w:t>Why — fits our corpus · what it costs · what would change it</w:t>
+            </w:r>
+          </w:p>
+        </w:tc>
+      </w:tr>
+      <w:tr>
         <w:tc>
           <w:tcPr>
             <w:tcW w:w="2200" w:type="dxa"/>
@@ -2766,7 +2380,11 @@
           </w:tcPr>
           <w:p>
             <w:r>
-              <w:t>Turn raw scans into a searchable, citation-preserving knowledge base clean enough to support &gt;=0.95 groundedness with 100% citation, within our robust/reliable NFR.</w:t>
+              <w:t xml:space="preserve">Turn raw scans into a searchable, citation-preserving knowledge base clean enough to support &gt;=0.95 </w:t>
+            </w:r>
+            <w:r>
+              <w:lastRenderedPageBreak/>
+              <w:t>groundedness with 100% citation, within our robust/reliable NFR.</w:t>
             </w:r>
           </w:p>
         </w:tc>
@@ -2776,21 +2394,17 @@
           </w:tcPr>
           <w:p>
             <w:r>
-              <w:t xml:space="preserve">This is what every A3 answer depends on -- an agent can't be </w:t>
-            </w:r>
-            <w:r>
-              <w:t>grounded if the retrieved text is wrong or uncited. Cost: OCR/layout accuracy work happens up-front, before any 'agent' behaviour exists. Would change if the NFR were e.g. latency instead of robustness -- we'd trade OCR quality work for speed.</w:t>
-            </w:r>
-          </w:p>
-        </w:tc>
-      </w:tr>
-      <w:tr>
-        <w:tblPrEx>
-          <w:tblCellMar>
-            <w:top w:w="0" w:type="dxa"/>
-            <w:bottom w:w="0" w:type="dxa"/>
-          </w:tblCellMar>
-        </w:tblPrEx>
+              <w:lastRenderedPageBreak/>
+              <w:t xml:space="preserve">This is what every A3 answer depends on -- an agent can't be grounded if the retrieved text is wrong or uncited. Cost: OCR/layout </w:t>
+            </w:r>
+            <w:r>
+              <w:lastRenderedPageBreak/>
+              <w:t>accuracy work happens up-front, before any 'agent' behaviour exists. Would change if the NFR were e.g. latency instead of robustness -- we'd trade OCR quality work for speed.</w:t>
+            </w:r>
+          </w:p>
+        </w:tc>
+      </w:tr>
+      <w:tr>
         <w:tc>
           <w:tcPr>
             <w:tcW w:w="2200" w:type="dxa"/>
@@ -2800,6 +2414,7 @@
               <w:spacing w:after="80"/>
             </w:pPr>
             <w:r>
+              <w:lastRenderedPageBreak/>
               <w:t>Data</w:t>
             </w:r>
           </w:p>
@@ -2810,11 +2425,183 @@
           </w:tcPr>
           <w:p>
             <w:r>
-              <w:t xml:space="preserve">1,107 page-images (bk2=445 train / bk1=662 test, split by whole book); 30 </w:t>
-            </w:r>
+              <w:t>1,107 page-images (bk2=445 train / bk1=662 test, split by whole book); 30 bk1 held-out pages with page-level labels for OCR CER measurement.</w:t>
+            </w:r>
+          </w:p>
+        </w:tc>
+        <w:tc>
+          <w:tcPr>
+            <w:tcW w:w="3760" w:type="dxa"/>
+          </w:tcPr>
+          <w:p>
+            <w:r>
+              <w:t>Whole-book splitting makes cross-split leakage impossible by construction, which matters because both books quote overlapping Materia Medica passages. Cost: held-out labels are currently Qwen-generated, not human-verified -- our biggest current data-quality risk. Would change once labels are hand-verified.</w:t>
+            </w:r>
+          </w:p>
+        </w:tc>
+      </w:tr>
+      <w:tr>
+        <w:tc>
+          <w:tcPr>
+            <w:tcW w:w="2200" w:type="dxa"/>
+          </w:tcPr>
+          <w:p>
+            <w:pPr>
+              <w:spacing w:after="80"/>
+            </w:pPr>
+            <w:r>
+              <w:t>Model</w:t>
+            </w:r>
+          </w:p>
+        </w:tc>
+        <w:tc>
+          <w:tcPr>
+            <w:tcW w:w="3400" w:type="dxa"/>
+          </w:tcPr>
+          <w:p>
+            <w:r>
+              <w:t>Tesseract 5 (ben+eng) baseline OCR; BAAI/bge-m3 embeddings; FAISS Flat index. No layout/enhancement model -- both are rule-based or disabled.</w:t>
+            </w:r>
+          </w:p>
+        </w:tc>
+        <w:tc>
+          <w:tcPr>
+            <w:tcW w:w="3760" w:type="dxa"/>
+          </w:tcPr>
+          <w:p>
+            <w:r>
+              <w:t>Tesseract is our reproduced-pretrained-method requirement; bge-m3 is the smallest good multilingual embedding that actually covers Bengali. Cost: no learned layout model means no true multi-column support if a future book needs it. Would change for a corpus speciality of degraded scans (justifies a learned enhancer) or real multi-column layout.</w:t>
+            </w:r>
+          </w:p>
+        </w:tc>
+      </w:tr>
+      <w:tr>
+        <w:tc>
+          <w:tcPr>
+            <w:tcW w:w="2200" w:type="dxa"/>
+          </w:tcPr>
+          <w:p>
+            <w:pPr>
+              <w:spacing w:after="80"/>
+            </w:pPr>
+            <w:r>
+              <w:t>Methods</w:t>
+            </w:r>
+          </w:p>
+        </w:tc>
+        <w:tc>
+          <w:tcPr>
+            <w:tcW w:w="3400" w:type="dxa"/>
+          </w:tcPr>
+          <w:p>
+            <w:r>
+              <w:t>Whole-page OCR at PSM 3, chosen over block segmentation after a held-out CER A/B (0.184 vs 0.483); entry-aware chunking keyed on remedy-alias markers with a 512/64-token fallback window.</w:t>
+            </w:r>
+          </w:p>
+        </w:tc>
+        <w:tc>
+          <w:tcPr>
+            <w:tcW w:w="3760" w:type="dxa"/>
+          </w:tcPr>
+          <w:p>
+            <w:r>
+              <w:t>The A/B test is the actual justification -- block segmentation measurably hurt accuracy on this single-column corpus. Cost: we lose the heading/body region tags block-mode would have given entry-aware chunking, recovered instead via remedy-marker detection at chunk time. Would change back to block mode for a corpus with real multi-column/footnote structure.</w:t>
+            </w:r>
+          </w:p>
+        </w:tc>
+      </w:tr>
+      <w:tr>
+        <w:tc>
+          <w:tcPr>
+            <w:tcW w:w="2200" w:type="dxa"/>
+          </w:tcPr>
+          <w:p>
+            <w:pPr>
+              <w:spacing w:after="80"/>
+            </w:pPr>
+            <w:r>
+              <w:t>Design</w:t>
+            </w:r>
+          </w:p>
+        </w:tc>
+        <w:tc>
+          <w:tcPr>
+            <w:tcW w:w="3400" w:type="dxa"/>
+          </w:tcPr>
+          <w:p>
+            <w:r>
+              <w:t>Fixed Page -&gt; Region -&gt; Chunk data contracts (contracts.py) carry page_id/doc_id/ocr_conf end-to-end so every stage -- and every future A3 citation -- can trace back to a scanned page.</w:t>
+            </w:r>
+          </w:p>
+        </w:tc>
+        <w:tc>
+          <w:tcPr>
+            <w:tcW w:w="3760" w:type="dxa"/>
+          </w:tcPr>
+          <w:p>
+            <w:r>
+              <w:t>This is what makes citation possible at all, and it's CI-enforced (test_contracts.py) so it can't silently drift. Cost: new metadata (e.g. remedy_ids as a first-class field) needs a contract change, deliberately friction-full. Would change if A3 grounding needs a field the current contract doesn't carry.</w:t>
+            </w:r>
+          </w:p>
+        </w:tc>
+      </w:tr>
+      <w:tr>
+        <w:tc>
+          <w:tcPr>
+            <w:tcW w:w="2200" w:type="dxa"/>
+          </w:tcPr>
+          <w:p>
+            <w:pPr>
+              <w:spacing w:after="80"/>
+            </w:pPr>
+            <w:r>
+              <w:t>Development</w:t>
+            </w:r>
+          </w:p>
+        </w:tc>
+        <w:tc>
+          <w:tcPr>
+            <w:tcW w:w="3400" w:type="dxa"/>
+          </w:tcPr>
+          <w:p>
+            <w:r>
+              <w:t>Held-out CER used as the deciding metric for every OCR/layout choice; two real regressions (DPI loss, TSV quote-swallowing) were caught by this harness before shipping, not after.</w:t>
+            </w:r>
+          </w:p>
+        </w:tc>
+        <w:tc>
+          <w:tcPr>
+            <w:tcW w:w="3760" w:type="dxa"/>
+          </w:tcPr>
+          <w:p>
+            <w:r>
+              <w:t>Measuring against the real held-out set -- not eyeballing OCR text -- is what caught both bugs; byte-identical output disproved a wrong hypothesis (DPI) before we shipped a fix that didn't work. Cost: this loop is slow (Tesseract per-page, no GPU) -- minutes per comparison. Would change with a faster/cached harness for A3-scale iteration.</w:t>
+            </w:r>
+          </w:p>
+        </w:tc>
+      </w:tr>
+      <w:tr>
+        <w:tc>
+          <w:tcPr>
+            <w:tcW w:w="2200" w:type="dxa"/>
+          </w:tcPr>
+          <w:p>
+            <w:pPr>
+              <w:spacing w:after="80"/>
+            </w:pPr>
             <w:r>
               <w:lastRenderedPageBreak/>
-              <w:t>bk1 held-out pages with page-level labels for OCR CER measurement.</w:t>
+              <w:t>Deployment</w:t>
+            </w:r>
+          </w:p>
+        </w:tc>
+        <w:tc>
+          <w:tcPr>
+            <w:tcW w:w="3400" w:type="dxa"/>
+          </w:tcPr>
+          <w:p>
+            <w:r>
+              <w:t>OCR/layout/chunk run CPU-only; embedding runs GPU (fp16) when available and falls back to CPU automatically; index build is a single batch job (scripts/build_index.sh), not incremental yet.</w:t>
             </w:r>
           </w:p>
         </w:tc>
@@ -2824,26 +2611,12 @@
           </w:tcPr>
           <w:p>
             <w:r>
-              <w:lastRenderedPageBreak/>
-              <w:t xml:space="preserve">Whole-book splitting makes cross-split leakage impossible by construction, which matters because both books quote </w:t>
-            </w:r>
-            <w:r>
-              <w:lastRenderedPageBreak/>
-              <w:t>o</w:t>
-            </w:r>
-            <w:r>
-              <w:t>verlapping Materia Medica passages. Cost: held-out labels are currently Qwen-generated, not human-verified -- our biggest current data-quality risk. Would change once labels are hand-verified.</w:t>
-            </w:r>
-          </w:p>
-        </w:tc>
-      </w:tr>
-      <w:tr>
-        <w:tblPrEx>
-          <w:tblCellMar>
-            <w:top w:w="0" w:type="dxa"/>
-            <w:bottom w:w="0" w:type="dxa"/>
-          </w:tblCellMar>
-        </w:tblPrEx>
+              <w:t>Matches our corpus size and Kaggle's free-tier T4 GPU; CPU-only OCR means the KB can still be rebuilt on a machine with no GPU, just slower. Cost: full rebuilds are all-or-nothing -- no incremental re-index yet. Would change if the corpus grew large enough that a full rebuild became too slow to iterate on.</w:t>
+            </w:r>
+          </w:p>
+        </w:tc>
+      </w:tr>
+      <w:tr>
         <w:tc>
           <w:tcPr>
             <w:tcW w:w="2200" w:type="dxa"/>
@@ -2853,8 +2626,7 @@
               <w:spacing w:after="80"/>
             </w:pPr>
             <w:r>
-              <w:lastRenderedPageBreak/>
-              <w:t>Model</w:t>
+              <w:t>MLOps</w:t>
             </w:r>
           </w:p>
         </w:tc>
@@ -2864,10 +2636,7 @@
           </w:tcPr>
           <w:p>
             <w:r>
-              <w:t>Tesseract 5 (ben+eng) baseline OCR; BAAI/bge-m3 embeddin</w:t>
-            </w:r>
-            <w:r>
-              <w:t>gs; FAISS Flat index. No layout/enhancement model -- both are rule-based or disabled.</w:t>
+              <w:t>Raw/interim data gitignored and re-fetchable via scripts/get_data.sh + data/provenance.md; preprocessing/OCR caches are fingerprinted on config so they auto-invalidate; every design decision and its measured evidence is logged in configs/design_choices.md and reports/pipeline_diagram.md.</w:t>
             </w:r>
           </w:p>
         </w:tc>
@@ -2877,249 +2646,7 @@
           </w:tcPr>
           <w:p>
             <w:r>
-              <w:t xml:space="preserve">Tesseract is our reproduced-pretrained-method requirement; bge-m3 is the smallest good multilingual embedding that actually covers Bengali. Cost: no learned layout model </w:t>
-            </w:r>
-            <w:r>
-              <w:t>means no true multi-column support if a future book needs it. Would change for a corpus speciality of degraded scans (justifies a learned enhancer) or real multi-column layout.</w:t>
-            </w:r>
-          </w:p>
-        </w:tc>
-      </w:tr>
-      <w:tr>
-        <w:tblPrEx>
-          <w:tblCellMar>
-            <w:top w:w="0" w:type="dxa"/>
-            <w:bottom w:w="0" w:type="dxa"/>
-          </w:tblCellMar>
-        </w:tblPrEx>
-        <w:tc>
-          <w:tcPr>
-            <w:tcW w:w="2200" w:type="dxa"/>
-          </w:tcPr>
-          <w:p>
-            <w:pPr>
-              <w:spacing w:after="80"/>
-            </w:pPr>
-            <w:r>
-              <w:t>Methods</w:t>
-            </w:r>
-          </w:p>
-        </w:tc>
-        <w:tc>
-          <w:tcPr>
-            <w:tcW w:w="3400" w:type="dxa"/>
-          </w:tcPr>
-          <w:p>
-            <w:r>
-              <w:t>Whole-page OCR at PSM 3, chosen over block segmentation after a held-o</w:t>
-            </w:r>
-            <w:r>
-              <w:t>ut CER A/B (0.184 vs 0.483); entry-aware chunking keyed on remedy-alias markers with a 512/64-token fallback window.</w:t>
-            </w:r>
-          </w:p>
-        </w:tc>
-        <w:tc>
-          <w:tcPr>
-            <w:tcW w:w="3760" w:type="dxa"/>
-          </w:tcPr>
-          <w:p>
-            <w:r>
-              <w:t>The A/B test is the actual justification -- block segmentation measurably hurt accuracy on this single-column corpus. Cost: we lose the hea</w:t>
-            </w:r>
-            <w:r>
-              <w:t>ding/body region tags block-mode would have given entry-aware chunking, recovered instead via remedy-marker detection at chunk time. Would change back to block mode for a corpus with real multi-column/footnote structure.</w:t>
-            </w:r>
-          </w:p>
-        </w:tc>
-      </w:tr>
-      <w:tr>
-        <w:tblPrEx>
-          <w:tblCellMar>
-            <w:top w:w="0" w:type="dxa"/>
-            <w:bottom w:w="0" w:type="dxa"/>
-          </w:tblCellMar>
-        </w:tblPrEx>
-        <w:tc>
-          <w:tcPr>
-            <w:tcW w:w="2200" w:type="dxa"/>
-          </w:tcPr>
-          <w:p>
-            <w:pPr>
-              <w:spacing w:after="80"/>
-            </w:pPr>
-            <w:r>
-              <w:t>Design</w:t>
-            </w:r>
-          </w:p>
-        </w:tc>
-        <w:tc>
-          <w:tcPr>
-            <w:tcW w:w="3400" w:type="dxa"/>
-          </w:tcPr>
-          <w:p>
-            <w:r>
-              <w:t>Fixed Page -&gt; Region -&gt; Chu</w:t>
-            </w:r>
-            <w:r>
-              <w:t>nk data contracts (contracts.py) carry page_id/doc_id/ocr_conf end-to-end so every stage -- and every future A3 citation -- can trace back to a scanned page.</w:t>
-            </w:r>
-          </w:p>
-        </w:tc>
-        <w:tc>
-          <w:tcPr>
-            <w:tcW w:w="3760" w:type="dxa"/>
-          </w:tcPr>
-          <w:p>
-            <w:r>
-              <w:t xml:space="preserve">This is what makes citation possible at all, and it's CI-enforced (test_contracts.py) so it can't </w:t>
-            </w:r>
-            <w:r>
-              <w:t>silently drift. Cost: new metadata (e.g. remedy_ids as a first-class field) needs a contract change, deliberately friction-full. Would change if A3 grounding needs a field the current contract doesn't carry.</w:t>
-            </w:r>
-          </w:p>
-        </w:tc>
-      </w:tr>
-      <w:tr>
-        <w:tblPrEx>
-          <w:tblCellMar>
-            <w:top w:w="0" w:type="dxa"/>
-            <w:bottom w:w="0" w:type="dxa"/>
-          </w:tblCellMar>
-        </w:tblPrEx>
-        <w:tc>
-          <w:tcPr>
-            <w:tcW w:w="2200" w:type="dxa"/>
-          </w:tcPr>
-          <w:p>
-            <w:pPr>
-              <w:spacing w:after="80"/>
-            </w:pPr>
-            <w:r>
-              <w:t>Development</w:t>
-            </w:r>
-          </w:p>
-        </w:tc>
-        <w:tc>
-          <w:tcPr>
-            <w:tcW w:w="3400" w:type="dxa"/>
-          </w:tcPr>
-          <w:p>
-            <w:r>
-              <w:t xml:space="preserve">Held-out CER used as the </w:t>
-            </w:r>
-            <w:r>
-              <w:t>deciding metric for every OCR/layout choice; two real regressions (DPI loss, TSV quote-swallowing) were caught by this harness before shipping, not after.</w:t>
-            </w:r>
-          </w:p>
-        </w:tc>
-        <w:tc>
-          <w:tcPr>
-            <w:tcW w:w="3760" w:type="dxa"/>
-          </w:tcPr>
-          <w:p>
-            <w:r>
-              <w:t>Measuring against the real held-out set -- not eyeballing OCR text -- is what caught both bugs; byte-</w:t>
-            </w:r>
-            <w:r>
-              <w:t>identical output disproved a wrong hypothesis (DPI) before we shipped a fix that didn't work. Cost: this loop is slow (Tesseract per-page, no GPU) -- minutes per comparison. Would change with a faster/cached harness for A3-scale iteration.</w:t>
-            </w:r>
-          </w:p>
-        </w:tc>
-      </w:tr>
-      <w:tr>
-        <w:tblPrEx>
-          <w:tblCellMar>
-            <w:top w:w="0" w:type="dxa"/>
-            <w:bottom w:w="0" w:type="dxa"/>
-          </w:tblCellMar>
-        </w:tblPrEx>
-        <w:tc>
-          <w:tcPr>
-            <w:tcW w:w="2200" w:type="dxa"/>
-          </w:tcPr>
-          <w:p>
-            <w:pPr>
-              <w:spacing w:after="80"/>
-            </w:pPr>
-            <w:r>
-              <w:t>Deployment</w:t>
-            </w:r>
-          </w:p>
-        </w:tc>
-        <w:tc>
-          <w:tcPr>
-            <w:tcW w:w="3400" w:type="dxa"/>
-          </w:tcPr>
-          <w:p>
-            <w:r>
-              <w:t>OCR/</w:t>
-            </w:r>
-            <w:r>
-              <w:t>layout/chunk run CPU-only; embedding runs GPU (fp16) when available and falls back to CPU automatically; index build is a single batch job (scripts/build_index.sh), not incremental yet.</w:t>
-            </w:r>
-          </w:p>
-        </w:tc>
-        <w:tc>
-          <w:tcPr>
-            <w:tcW w:w="3760" w:type="dxa"/>
-          </w:tcPr>
-          <w:p>
-            <w:r>
-              <w:t>Matches our corpus size and Kaggle's free-tier T4 GPU; CPU-only OCR me</w:t>
-            </w:r>
-            <w:r>
-              <w:t>ans the KB can still be rebuilt on a machine with no GPU, just slower. Cost: full rebuilds are all-or-nothing -- no incremental re-index yet. Would change if the corpus grew large enough that a full rebuild became too slow to iterate on.</w:t>
-            </w:r>
-          </w:p>
-        </w:tc>
-      </w:tr>
-      <w:tr>
-        <w:tblPrEx>
-          <w:tblCellMar>
-            <w:top w:w="0" w:type="dxa"/>
-            <w:bottom w:w="0" w:type="dxa"/>
-          </w:tblCellMar>
-        </w:tblPrEx>
-        <w:tc>
-          <w:tcPr>
-            <w:tcW w:w="2200" w:type="dxa"/>
-          </w:tcPr>
-          <w:p>
-            <w:pPr>
-              <w:spacing w:after="80"/>
-            </w:pPr>
-            <w:r>
-              <w:lastRenderedPageBreak/>
-              <w:t>MLOps</w:t>
-            </w:r>
-          </w:p>
-        </w:tc>
-        <w:tc>
-          <w:tcPr>
-            <w:tcW w:w="3400" w:type="dxa"/>
-          </w:tcPr>
-          <w:p>
-            <w:r>
-              <w:t>Raw/interim</w:t>
-            </w:r>
-            <w:r>
-              <w:t xml:space="preserve"> data gitignored and re-fetchable via scripts/get_data.sh + data/provenance.md; preprocessing/OCR caches are fingerprinted on config so they auto-invalidate; every design decision and its measured evidence is logged in configs/design_choices.md and reports</w:t>
-            </w:r>
-            <w:r>
-              <w:t>/pipeline_diagram.md.</w:t>
-            </w:r>
-          </w:p>
-        </w:tc>
-        <w:tc>
-          <w:tcPr>
-            <w:tcW w:w="3760" w:type="dxa"/>
-          </w:tcPr>
-          <w:p>
-            <w:r>
-              <w:t>Keeps the repo small and reproducible from source instead of shipping large binaries; fingerprinted caching means nobody has to remember to manually clear stale OCR output after a config change -- a mistake we were otherwise exposed t</w:t>
-            </w:r>
-            <w:r>
-              <w:t>o, given how much OCR config we've already tuned. Would change to add index versioning/monitoring once the KB is served in A4.</w:t>
+              <w:t>Keeps the repo small and reproducible from source instead of shipping large binaries; fingerprinted caching means nobody has to remember to manually clear stale OCR output after a config change -- a mistake we were otherwise exposed to, given how much OCR config we've already tuned. Would change to add index versioning/monitoring once the KB is served in A4.</w:t>
             </w:r>
           </w:p>
         </w:tc>
@@ -3154,17 +2681,7 @@
           <w:sz w:val="18"/>
           <w:szCs w:val="18"/>
         </w:rPr>
-        <w:t>&lt;their s</w:t>
-      </w:r>
-      <w:r>
-        <w:rPr>
-          <w:i/>
-          <w:iCs/>
-          <w:color w:val="595959"/>
-          <w:sz w:val="18"/>
-          <w:szCs w:val="18"/>
-        </w:rPr>
-        <w:t>tudent number&gt;.txt</w:t>
+        <w:t>&lt;their student number&gt;.txt</w:t>
       </w:r>
       <w:r>
         <w:t>, containing the full AI conversation behind the sections they led.</w:t>
@@ -3192,12 +2709,6 @@
         <w:gridCol w:w="5960"/>
       </w:tblGrid>
       <w:tr>
-        <w:tblPrEx>
-          <w:tblCellMar>
-            <w:top w:w="0" w:type="dxa"/>
-            <w:bottom w:w="0" w:type="dxa"/>
-          </w:tblCellMar>
-        </w:tblPrEx>
         <w:trPr>
           <w:tblHeader/>
         </w:trPr>
@@ -3241,12 +2752,6 @@
         </w:tc>
       </w:tr>
       <w:tr>
-        <w:tblPrEx>
-          <w:tblCellMar>
-            <w:top w:w="0" w:type="dxa"/>
-            <w:bottom w:w="0" w:type="dxa"/>
-          </w:tblCellMar>
-        </w:tblPrEx>
         <w:tc>
           <w:tcPr>
             <w:tcW w:w="3400" w:type="dxa"/>
@@ -3282,12 +2787,6 @@
         </w:tc>
       </w:tr>
       <w:tr>
-        <w:tblPrEx>
-          <w:tblCellMar>
-            <w:top w:w="0" w:type="dxa"/>
-            <w:bottom w:w="0" w:type="dxa"/>
-          </w:tblCellMar>
-        </w:tblPrEx>
         <w:tc>
           <w:tcPr>
             <w:tcW w:w="3400" w:type="dxa"/>
@@ -3323,12 +2822,6 @@
         </w:tc>
       </w:tr>
       <w:tr>
-        <w:tblPrEx>
-          <w:tblCellMar>
-            <w:top w:w="0" w:type="dxa"/>
-            <w:bottom w:w="0" w:type="dxa"/>
-          </w:tblCellMar>
-        </w:tblPrEx>
         <w:tc>
           <w:tcPr>
             <w:tcW w:w="3400" w:type="dxa"/>
@@ -3421,12 +2914,6 @@
         <w:gridCol w:w="5560"/>
       </w:tblGrid>
       <w:tr>
-        <w:tblPrEx>
-          <w:tblCellMar>
-            <w:top w:w="0" w:type="dxa"/>
-            <w:bottom w:w="0" w:type="dxa"/>
-          </w:tblCellMar>
-        </w:tblPrEx>
         <w:trPr>
           <w:tblHeader/>
         </w:trPr>
@@ -3470,12 +2957,6 @@
         </w:tc>
       </w:tr>
       <w:tr>
-        <w:tblPrEx>
-          <w:tblCellMar>
-            <w:top w:w="0" w:type="dxa"/>
-            <w:bottom w:w="0" w:type="dxa"/>
-          </w:tblCellMar>
-        </w:tblPrEx>
         <w:tc>
           <w:tcPr>
             <w:tcW w:w="3800" w:type="dxa"/>
@@ -3504,12 +2985,6 @@
         </w:tc>
       </w:tr>
       <w:tr>
-        <w:tblPrEx>
-          <w:tblCellMar>
-            <w:top w:w="0" w:type="dxa"/>
-            <w:bottom w:w="0" w:type="dxa"/>
-          </w:tblCellMar>
-        </w:tblPrEx>
         <w:tc>
           <w:tcPr>
             <w:tcW w:w="3800" w:type="dxa"/>
@@ -3538,12 +3013,6 @@
         </w:tc>
       </w:tr>
       <w:tr>
-        <w:tblPrEx>
-          <w:tblCellMar>
-            <w:top w:w="0" w:type="dxa"/>
-            <w:bottom w:w="0" w:type="dxa"/>
-          </w:tblCellMar>
-        </w:tblPrEx>
         <w:tc>
           <w:tcPr>
             <w:tcW w:w="3800" w:type="dxa"/>
@@ -3572,12 +3041,6 @@
         </w:tc>
       </w:tr>
       <w:tr>
-        <w:tblPrEx>
-          <w:tblCellMar>
-            <w:top w:w="0" w:type="dxa"/>
-            <w:bottom w:w="0" w:type="dxa"/>
-          </w:tblCellMar>
-        </w:tblPrEx>
         <w:tc>
           <w:tcPr>
             <w:tcW w:w="3800" w:type="dxa"/>
@@ -3606,12 +3069,6 @@
         </w:tc>
       </w:tr>
       <w:tr>
-        <w:tblPrEx>
-          <w:tblCellMar>
-            <w:top w:w="0" w:type="dxa"/>
-            <w:bottom w:w="0" w:type="dxa"/>
-          </w:tblCellMar>
-        </w:tblPrEx>
         <w:tc>
           <w:tcPr>
             <w:tcW w:w="3800" w:type="dxa"/>
@@ -3640,12 +3097,6 @@
         </w:tc>
       </w:tr>
       <w:tr>
-        <w:tblPrEx>
-          <w:tblCellMar>
-            <w:top w:w="0" w:type="dxa"/>
-            <w:bottom w:w="0" w:type="dxa"/>
-          </w:tblCellMar>
-        </w:tblPrEx>
         <w:tc>
           <w:tcPr>
             <w:tcW w:w="3800" w:type="dxa"/>
@@ -3674,12 +3125,6 @@
         </w:tc>
       </w:tr>
       <w:tr>
-        <w:tblPrEx>
-          <w:tblCellMar>
-            <w:top w:w="0" w:type="dxa"/>
-            <w:bottom w:w="0" w:type="dxa"/>
-          </w:tblCellMar>
-        </w:tblPrEx>
         <w:tc>
           <w:tcPr>
             <w:tcW w:w="3800" w:type="dxa"/>
@@ -3744,12 +3189,6 @@
         <w:gridCol w:w="2000"/>
       </w:tblGrid>
       <w:tr>
-        <w:tblPrEx>
-          <w:tblCellMar>
-            <w:top w:w="0" w:type="dxa"/>
-            <w:bottom w:w="0" w:type="dxa"/>
-          </w:tblCellMar>
-        </w:tblPrEx>
         <w:tc>
           <w:tcPr>
             <w:tcW w:w="9360" w:type="dxa"/>
@@ -3774,12 +3213,6 @@
         </w:tc>
       </w:tr>
       <w:tr>
-        <w:tblPrEx>
-          <w:tblCellMar>
-            <w:top w:w="0" w:type="dxa"/>
-            <w:bottom w:w="0" w:type="dxa"/>
-          </w:tblCellMar>
-        </w:tblPrEx>
         <w:trPr>
           <w:tblHeader/>
         </w:trPr>
@@ -3798,6 +3231,7 @@
                 <w:bCs/>
                 <w:color w:val="FFFFFF"/>
               </w:rPr>
+              <w:lastRenderedPageBreak/>
               <w:t>What we assess</w:t>
             </w:r>
           </w:p>
@@ -3823,12 +3257,6 @@
         </w:tc>
       </w:tr>
       <w:tr>
-        <w:tblPrEx>
-          <w:tblCellMar>
-            <w:top w:w="0" w:type="dxa"/>
-            <w:bottom w:w="0" w:type="dxa"/>
-          </w:tblCellMar>
-        </w:tblPrEx>
         <w:tc>
           <w:tcPr>
             <w:tcW w:w="7360" w:type="dxa"/>
@@ -3857,12 +3285,6 @@
         </w:tc>
       </w:tr>
       <w:tr>
-        <w:tblPrEx>
-          <w:tblCellMar>
-            <w:top w:w="0" w:type="dxa"/>
-            <w:bottom w:w="0" w:type="dxa"/>
-          </w:tblCellMar>
-        </w:tblPrEx>
         <w:tc>
           <w:tcPr>
             <w:tcW w:w="7360" w:type="dxa"/>
@@ -3891,12 +3313,6 @@
         </w:tc>
       </w:tr>
       <w:tr>
-        <w:tblPrEx>
-          <w:tblCellMar>
-            <w:top w:w="0" w:type="dxa"/>
-            <w:bottom w:w="0" w:type="dxa"/>
-          </w:tblCellMar>
-        </w:tblPrEx>
         <w:tc>
           <w:tcPr>
             <w:tcW w:w="7360" w:type="dxa"/>
@@ -3925,12 +3341,6 @@
         </w:tc>
       </w:tr>
       <w:tr>
-        <w:tblPrEx>
-          <w:tblCellMar>
-            <w:top w:w="0" w:type="dxa"/>
-            <w:bottom w:w="0" w:type="dxa"/>
-          </w:tblCellMar>
-        </w:tblPrEx>
         <w:tc>
           <w:tcPr>
             <w:tcW w:w="7360" w:type="dxa"/>
@@ -3959,12 +3369,6 @@
         </w:tc>
       </w:tr>
       <w:tr>
-        <w:tblPrEx>
-          <w:tblCellMar>
-            <w:top w:w="0" w:type="dxa"/>
-            <w:bottom w:w="0" w:type="dxa"/>
-          </w:tblCellMar>
-        </w:tblPrEx>
         <w:tc>
           <w:tcPr>
             <w:tcW w:w="7360" w:type="dxa"/>
@@ -3974,7 +3378,6 @@
               <w:spacing w:after="80"/>
             </w:pPr>
             <w:r>
-              <w:lastRenderedPageBreak/>
               <w:t>Section 5 — real evidence: OCR quality + a working retrieval</w:t>
             </w:r>
           </w:p>
@@ -3994,12 +3397,6 @@
         </w:tc>
       </w:tr>
       <w:tr>
-        <w:tblPrEx>
-          <w:tblCellMar>
-            <w:top w:w="0" w:type="dxa"/>
-            <w:bottom w:w="0" w:type="dxa"/>
-          </w:tblCellMar>
-        </w:tblPrEx>
         <w:tc>
           <w:tcPr>
             <w:tcW w:w="7360" w:type="dxa"/>
@@ -4028,12 +3425,6 @@
         </w:tc>
       </w:tr>
       <w:tr>
-        <w:tblPrEx>
-          <w:tblCellMar>
-            <w:top w:w="0" w:type="dxa"/>
-            <w:bottom w:w="0" w:type="dxa"/>
-          </w:tblCellMar>
-        </w:tblPrEx>
         <w:tc>
           <w:tcPr>
             <w:tcW w:w="7360" w:type="dxa"/>
@@ -4062,12 +3453,6 @@
         </w:tc>
       </w:tr>
       <w:tr>
-        <w:tblPrEx>
-          <w:tblCellMar>
-            <w:top w:w="0" w:type="dxa"/>
-            <w:bottom w:w="0" w:type="dxa"/>
-          </w:tblCellMar>
-        </w:tblPrEx>
         <w:tc>
           <w:tcPr>
             <w:tcW w:w="7360" w:type="dxa"/>
@@ -4077,10 +3462,7 @@
               <w:spacing w:after="80"/>
             </w:pPr>
             <w:r>
-              <w:t>Section 8 + submi</w:t>
-            </w:r>
-            <w:r>
-              <w:t>ssion structure correct</w:t>
+              <w:t>Section 8 + submission structure correct</w:t>
             </w:r>
           </w:p>
         </w:tc>
@@ -4111,7 +3493,7 @@
 </file>
 
 <file path=word/numbering.xml><?xml version="1.0" encoding="utf-8"?>
-<w:numbering xmlns:wpc="http://schemas.microsoft.com/office/word/2010/wordprocessingCanvas" xmlns:cx="http://schemas.microsoft.com/office/drawing/2014/chartex" xmlns:cx1="http://schemas.microsoft.com/office/drawing/2015/9/8/chartex" xmlns:cx2="http://schemas.microsoft.com/office/drawing/2015/10/21/chartex" xmlns:cx3="http://schemas.microsoft.com/office/drawing/2016/5/9/chartex" xmlns:cx4="http://schemas.microsoft.com/office/drawing/2016/5/10/chartex" xmlns:cx5="http://schemas.microsoft.com/office/drawing/2016/5/11/chartex" xmlns:cx6="http://schemas.microsoft.com/office/drawing/2016/5/12/chartex" xmlns:cx7="http://schemas.microsoft.com/office/drawing/2016/5/13/chartex" xmlns:cx8="http://schemas.microsoft.com/office/drawing/2016/5/14/chartex" xmlns:mc="http://schemas.openxmlformats.org/markup-compatibility/2006" xmlns:aink="http://schemas.microsoft.com/office/drawing/2016/ink" xmlns:am3d="http://schemas.microsoft.com/office/drawing/2017/model3d" xmlns:o="urn:schemas-microsoft-com:office:office" xmlns:r="http://schemas.openxmlformats.org/officeDocument/2006/relationships" xmlns:m="http://schemas.openxmlformats.org/officeDocument/2006/math" xmlns:v="urn:schemas-microsoft-com:vml" xmlns:wp14="http://schemas.microsoft.com/office/word/2010/wordprocessingDrawing" xmlns:wp="http://schemas.openxmlformats.org/drawingml/2006/wordprocessingDrawing" xmlns:w10="urn:schemas-microsoft-com:office:word" xmlns:w="http://schemas.openxmlformats.org/wordprocessingml/2006/main" xmlns:w14="http://schemas.microsoft.com/office/word/2010/wordml" xmlns:w15="http://schemas.microsoft.com/office/word/2012/wordml" xmlns:w16cex="http://schemas.microsoft.com/office/word/2018/wordml/cex" xmlns:w16cid="http://schemas.microsoft.com/office/word/2016/wordml/cid" xmlns:w16="http://schemas.microsoft.com/office/word/2018/wordml" xmlns:w16sdtdh="http://schemas.microsoft.com/office/word/2020/wordml/sdtdatahash" xmlns:w16se="http://schemas.microsoft.com/office/word/2015/wordml/symex" xmlns:wpg="http://schemas.microsoft.com/office/word/2010/wordprocessingGroup" xmlns:wpi="http://schemas.microsoft.com/office/word/2010/wordprocessingInk" xmlns:wne="http://schemas.microsoft.com/office/word/2006/wordml" xmlns:wps="http://schemas.microsoft.com/office/word/2010/wordprocessingShape" mc:Ignorable="w14 w15 w16se w16cid w16 w16cex w16sdtdh wp14">
+<w:numbering xmlns:wpc="http://schemas.microsoft.com/office/word/2010/wordprocessingCanvas" xmlns:cx="http://schemas.microsoft.com/office/drawing/2014/chartex" xmlns:cx1="http://schemas.microsoft.com/office/drawing/2015/9/8/chartex" xmlns:cx2="http://schemas.microsoft.com/office/drawing/2015/10/21/chartex" xmlns:cx3="http://schemas.microsoft.com/office/drawing/2016/5/9/chartex" xmlns:cx4="http://schemas.microsoft.com/office/drawing/2016/5/10/chartex" xmlns:cx5="http://schemas.microsoft.com/office/drawing/2016/5/11/chartex" xmlns:cx6="http://schemas.microsoft.com/office/drawing/2016/5/12/chartex" xmlns:cx7="http://schemas.microsoft.com/office/drawing/2016/5/13/chartex" xmlns:cx8="http://schemas.microsoft.com/office/drawing/2016/5/14/chartex" xmlns:mc="http://schemas.openxmlformats.org/markup-compatibility/2006" xmlns:aink="http://schemas.microsoft.com/office/drawing/2016/ink" xmlns:am3d="http://schemas.microsoft.com/office/drawing/2017/model3d" xmlns:o="urn:schemas-microsoft-com:office:office" xmlns:oel="http://schemas.microsoft.com/office/2019/extlst" xmlns:r="http://schemas.openxmlformats.org/officeDocument/2006/relationships" xmlns:m="http://schemas.openxmlformats.org/officeDocument/2006/math" xmlns:v="urn:schemas-microsoft-com:vml" xmlns:wp14="http://schemas.microsoft.com/office/word/2010/wordprocessingDrawing" xmlns:wp="http://schemas.openxmlformats.org/drawingml/2006/wordprocessingDrawing" xmlns:w10="urn:schemas-microsoft-com:office:word" xmlns:w="http://schemas.openxmlformats.org/wordprocessingml/2006/main" xmlns:w14="http://schemas.microsoft.com/office/word/2010/wordml" xmlns:w15="http://schemas.microsoft.com/office/word/2012/wordml" xmlns:w16cei="http://schemas.microsoft.com/office/word/2026/wordml/cei" xmlns:w16cex="http://schemas.microsoft.com/office/word/2018/wordml/cex" xmlns:w16cid="http://schemas.microsoft.com/office/word/2016/wordml/cid" xmlns:w16="http://schemas.microsoft.com/office/word/2018/wordml" xmlns:w16du="http://schemas.microsoft.com/office/word/2023/wordml/word16du" xmlns:w16sdtdh="http://schemas.microsoft.com/office/word/2020/wordml/sdtdatahash" xmlns:w16sdtfl="http://schemas.microsoft.com/office/word/2024/wordml/sdtformatlock" xmlns:w16se="http://schemas.microsoft.com/office/word/2015/wordml/symex" xmlns:wpg="http://schemas.microsoft.com/office/word/2010/wordprocessingGroup" xmlns:wpi="http://schemas.microsoft.com/office/word/2010/wordprocessingInk" xmlns:wne="http://schemas.microsoft.com/office/word/2006/wordml" xmlns:wps="http://schemas.microsoft.com/office/word/2010/wordprocessingShape" mc:Ignorable="w14 w15 w16se w16cid w16 w16cex w16sdtdh w16sdtfl w16du wp14">
   <w:abstractNum w:abstractNumId="0" w15:restartNumberingAfterBreak="0">
     <w:nsid w:val="67A8667D"/>
     <w:multiLevelType w:val="hybridMultilevel"/>
@@ -4198,7 +3580,7 @@
       </w:pPr>
     </w:lvl>
   </w:abstractNum>
-  <w:num w:numId="1">
+  <w:num w:numId="1" w16cid:durableId="2128767854">
     <w:abstractNumId w:val="0"/>
     <w:lvlOverride w:ilvl="0">
       <w:startOverride w:val="1"/>
@@ -4208,7 +3590,7 @@
 </file>
 
 <file path=word/styles.xml><?xml version="1.0" encoding="utf-8"?>
-<w:styles xmlns:mc="http://schemas.openxmlformats.org/markup-compatibility/2006" xmlns:r="http://schemas.openxmlformats.org/officeDocument/2006/relationships" xmlns:w="http://schemas.openxmlformats.org/wordprocessingml/2006/main" xmlns:w14="http://schemas.microsoft.com/office/word/2010/wordml" xmlns:w15="http://schemas.microsoft.com/office/word/2012/wordml" xmlns:w16cex="http://schemas.microsoft.com/office/word/2018/wordml/cex" xmlns:w16cid="http://schemas.microsoft.com/office/word/2016/wordml/cid" xmlns:w16="http://schemas.microsoft.com/office/word/2018/wordml" xmlns:w16sdtdh="http://schemas.microsoft.com/office/word/2020/wordml/sdtdatahash" xmlns:w16se="http://schemas.microsoft.com/office/word/2015/wordml/symex" mc:Ignorable="w14 w15 w16se w16cid w16 w16cex w16sdtdh">
+<w:styles xmlns:mc="http://schemas.openxmlformats.org/markup-compatibility/2006" xmlns:r="http://schemas.openxmlformats.org/officeDocument/2006/relationships" xmlns:w="http://schemas.openxmlformats.org/wordprocessingml/2006/main" xmlns:w14="http://schemas.microsoft.com/office/word/2010/wordml" xmlns:w15="http://schemas.microsoft.com/office/word/2012/wordml" xmlns:w16cex="http://schemas.microsoft.com/office/word/2018/wordml/cex" xmlns:w16cid="http://schemas.microsoft.com/office/word/2016/wordml/cid" xmlns:w16="http://schemas.microsoft.com/office/word/2018/wordml" xmlns:w16du="http://schemas.microsoft.com/office/word/2023/wordml/word16du" xmlns:w16sdtdh="http://schemas.microsoft.com/office/word/2020/wordml/sdtdatahash" xmlns:w16sdtfl="http://schemas.microsoft.com/office/word/2024/wordml/sdtformatlock" xmlns:w16se="http://schemas.microsoft.com/office/word/2015/wordml/symex" mc:Ignorable="w14 w15 w16se w16cid w16 w16cex w16sdtdh w16sdtfl w16du">
   <w:docDefaults>
     <w:rPrDefault>
       <w:rPr>
@@ -4688,7 +4070,6 @@
   <w:style w:type="character" w:default="1" w:styleId="DefaultParagraphFont">
     <w:name w:val="Default Paragraph Font"/>
     <w:uiPriority w:val="1"/>
-    <w:semiHidden/>
     <w:unhideWhenUsed/>
   </w:style>
   <w:style w:type="table" w:default="1" w:styleId="TableNormal">
@@ -4800,6 +4181,33 @@
     <w:semiHidden/>
     <w:unhideWhenUsed/>
     <w:rPr>
+      <w:sz w:val="20"/>
+      <w:szCs w:val="20"/>
+    </w:rPr>
+  </w:style>
+  <w:style w:type="paragraph" w:styleId="HTMLPreformatted">
+    <w:name w:val="HTML Preformatted"/>
+    <w:basedOn w:val="Normal"/>
+    <w:link w:val="HTMLPreformattedChar"/>
+    <w:uiPriority w:val="99"/>
+    <w:semiHidden/>
+    <w:unhideWhenUsed/>
+    <w:rsid w:val="000875E5"/>
+    <w:rPr>
+      <w:rFonts w:ascii="Consolas" w:hAnsi="Consolas"/>
+      <w:sz w:val="20"/>
+      <w:szCs w:val="20"/>
+    </w:rPr>
+  </w:style>
+  <w:style w:type="character" w:customStyle="1" w:styleId="HTMLPreformattedChar">
+    <w:name w:val="HTML Preformatted Char"/>
+    <w:basedOn w:val="DefaultParagraphFont"/>
+    <w:link w:val="HTMLPreformatted"/>
+    <w:uiPriority w:val="99"/>
+    <w:semiHidden/>
+    <w:rsid w:val="000875E5"/>
+    <w:rPr>
+      <w:rFonts w:ascii="Consolas" w:hAnsi="Consolas"/>
       <w:sz w:val="20"/>
       <w:szCs w:val="20"/>
     </w:rPr>

</xml_diff>